<commit_message>
Esto va de locos, algunas vistas creadas
</commit_message>
<xml_diff>
--- a/Información de la creación del proyecto.docx
+++ b/Información de la creación del proyecto.docx
@@ -371,21 +371,7 @@
                                       <w:rPr>
                                         <w:color w:val="FFFFFF" w:themeColor="background1"/>
                                       </w:rPr>
-                                      <w:t xml:space="preserve">Proyecto propuesto en las prácticas de </w:t>
-                                    </w:r>
-                                    <w:proofErr w:type="spellStart"/>
-                                    <w:r>
-                                      <w:rPr>
-                                        <w:color w:val="FFFFFF" w:themeColor="background1"/>
-                                      </w:rPr>
-                                      <w:t>Globomatik</w:t>
-                                    </w:r>
-                                    <w:proofErr w:type="spellEnd"/>
-                                    <w:r>
-                                      <w:rPr>
-                                        <w:color w:val="FFFFFF" w:themeColor="background1"/>
-                                      </w:rPr>
-                                      <w:t xml:space="preserve"> para recursos humanos</w:t>
+                                      <w:t>Proyecto propuesto en las prácticas de Globomatik para recursos humanos</w:t>
                                     </w:r>
                                   </w:sdtContent>
                                 </w:sdt>
@@ -440,19 +426,11 @@
                                 </w:rPr>
                                 <w:t xml:space="preserve">Proyecto propuesto en las prácticas de </w:t>
                               </w:r>
-                              <w:proofErr w:type="spellStart"/>
                               <w:r>
                                 <w:rPr>
                                   <w:color w:val="FFFFFF" w:themeColor="background1"/>
                                 </w:rPr>
-                                <w:t>Globomatik</w:t>
-                              </w:r>
-                              <w:proofErr w:type="spellEnd"/>
-                              <w:r>
-                                <w:rPr>
-                                  <w:color w:val="FFFFFF" w:themeColor="background1"/>
-                                </w:rPr>
-                                <w:t xml:space="preserve"> para recursos humanos</w:t>
+                                <w:t>Globomatik para recursos humanos</w:t>
                               </w:r>
                             </w:sdtContent>
                           </w:sdt>
@@ -940,30 +918,16 @@
           </w:r>
         </w:p>
         <w:p>
-          <w:r>
-            <w:fldChar w:fldCharType="begin"/>
-          </w:r>
-          <w:r>
-            <w:instrText xml:space="preserve"> TOC \o "1-3" \h \z \u </w:instrText>
-          </w:r>
-          <w:r>
-            <w:fldChar w:fldCharType="separate"/>
-          </w:r>
-          <w:r>
-            <w:rPr>
-              <w:b/>
-              <w:bCs/>
-              <w:noProof/>
-            </w:rPr>
-            <w:t>No se encontraron entradas de tabla de contenido.</w:t>
-          </w:r>
-          <w:r>
-            <w:rPr>
-              <w:b/>
-              <w:bCs/>
-            </w:rPr>
-            <w:fldChar w:fldCharType="end"/>
-          </w:r>
+          <w:fldSimple w:instr=" TOC \o &quot;1-3&quot; \h \z \u ">
+            <w:r>
+              <w:rPr>
+                <w:b/>
+                <w:bCs/>
+                <w:noProof/>
+              </w:rPr>
+              <w:t>No se encontraron entradas de tabla de contenido.</w:t>
+            </w:r>
+          </w:fldSimple>
         </w:p>
       </w:sdtContent>
     </w:sdt>
@@ -997,6 +961,7 @@
         <w:t xml:space="preserve">1.- </w:t>
       </w:r>
       <w:proofErr w:type="spellStart"/>
+      <w:proofErr w:type="gramStart"/>
       <w:r>
         <w:rPr>
           <w:rFonts w:ascii="Times New Roman" w:eastAsia="Times New Roman" w:hAnsi="Times New Roman" w:cs="Times New Roman"/>
@@ -1018,7 +983,19 @@
           <w:lang w:eastAsia="es-ES"/>
           <w14:ligatures w14:val="none"/>
         </w:rPr>
-        <w:t>(Tablas)</w:t>
+        <w:t>(</w:t>
+      </w:r>
+      <w:proofErr w:type="gramEnd"/>
+      <w:r>
+        <w:rPr>
+          <w:rFonts w:ascii="Times New Roman" w:eastAsia="Times New Roman" w:hAnsi="Times New Roman" w:cs="Times New Roman"/>
+          <w:b/>
+          <w:bCs/>
+          <w:kern w:val="0"/>
+          <w:lang w:eastAsia="es-ES"/>
+          <w14:ligatures w14:val="none"/>
+        </w:rPr>
+        <w:t>Tablas)</w:t>
       </w:r>
     </w:p>
     <w:p>
@@ -6761,7 +6738,7 @@
           <w:lang w:eastAsia="es-ES"/>
           <w14:ligatures w14:val="none"/>
         </w:rPr>
-        <w:t xml:space="preserve"> para no llenar la base de </w:t>
+        <w:t xml:space="preserve"> para no llenar la base de datos de basura. Con esto, si un administrador aprueba unas vacaciones o borra </w:t>
       </w:r>
       <w:r>
         <w:rPr>
@@ -6771,7 +6748,7 @@
           <w14:ligatures w14:val="none"/>
         </w:rPr>
         <w:lastRenderedPageBreak/>
-        <w:t xml:space="preserve">datos de basura. Con esto, si un administrador aprueba unas vacaciones o borra una nómina, queda grabado a fuego en la tabla </w:t>
+        <w:t xml:space="preserve">una nómina, queda grabado a fuego en la tabla </w:t>
       </w:r>
       <w:proofErr w:type="spellStart"/>
       <w:r>
@@ -6794,6 +6771,1803 @@
           <w14:ligatures w14:val="none"/>
         </w:rPr>
         <w:t xml:space="preserve"> con la fecha, la hora, y el ID del usuario responsable .</w:t>
+      </w:r>
+    </w:p>
+    <w:p>
+      <w:pPr>
+        <w:spacing w:before="100" w:beforeAutospacing="1" w:after="100" w:afterAutospacing="1" w:line="240" w:lineRule="auto"/>
+        <w:ind w:left="720"/>
+        <w:rPr>
+          <w:rFonts w:ascii="Times New Roman" w:eastAsia="Times New Roman" w:hAnsi="Times New Roman" w:cs="Times New Roman"/>
+          <w:kern w:val="0"/>
+          <w:lang w:eastAsia="es-ES"/>
+          <w14:ligatures w14:val="none"/>
+        </w:rPr>
+      </w:pPr>
+    </w:p>
+    <w:p>
+      <w:pPr>
+        <w:spacing w:before="100" w:beforeAutospacing="1" w:after="100" w:afterAutospacing="1" w:line="240" w:lineRule="auto"/>
+        <w:outlineLvl w:val="2"/>
+        <w:rPr>
+          <w:rFonts w:ascii="Times New Roman" w:eastAsia="Times New Roman" w:hAnsi="Times New Roman" w:cs="Times New Roman"/>
+          <w:b/>
+          <w:bCs/>
+          <w:kern w:val="0"/>
+          <w:sz w:val="27"/>
+          <w:szCs w:val="27"/>
+          <w:lang w:eastAsia="es-ES"/>
+          <w14:ligatures w14:val="none"/>
+        </w:rPr>
+      </w:pPr>
+      <w:r>
+        <w:rPr>
+          <w:rFonts w:ascii="Times New Roman" w:eastAsia="Times New Roman" w:hAnsi="Times New Roman" w:cs="Times New Roman"/>
+          <w:b/>
+          <w:bCs/>
+          <w:kern w:val="0"/>
+          <w:sz w:val="27"/>
+          <w:szCs w:val="27"/>
+          <w:lang w:eastAsia="es-ES"/>
+          <w14:ligatures w14:val="none"/>
+        </w:rPr>
+        <w:t xml:space="preserve">2.- </w:t>
+      </w:r>
+      <w:proofErr w:type="spellStart"/>
+      <w:r>
+        <w:rPr>
+          <w:rFonts w:ascii="Times New Roman" w:eastAsia="Times New Roman" w:hAnsi="Times New Roman" w:cs="Times New Roman"/>
+          <w:b/>
+          <w:bCs/>
+          <w:kern w:val="0"/>
+          <w:sz w:val="27"/>
+          <w:szCs w:val="27"/>
+          <w:lang w:eastAsia="es-ES"/>
+          <w14:ligatures w14:val="none"/>
+        </w:rPr>
+        <w:t>Frontend</w:t>
+      </w:r>
+      <w:proofErr w:type="spellEnd"/>
+      <w:r>
+        <w:rPr>
+          <w:rFonts w:ascii="Times New Roman" w:eastAsia="Times New Roman" w:hAnsi="Times New Roman" w:cs="Times New Roman"/>
+          <w:b/>
+          <w:bCs/>
+          <w:kern w:val="0"/>
+          <w:sz w:val="27"/>
+          <w:szCs w:val="27"/>
+          <w:lang w:eastAsia="es-ES"/>
+          <w14:ligatures w14:val="none"/>
+        </w:rPr>
+        <w:t xml:space="preserve"> (</w:t>
+      </w:r>
+      <w:proofErr w:type="spellStart"/>
+      <w:r>
+        <w:rPr>
+          <w:rFonts w:ascii="Times New Roman" w:eastAsia="Times New Roman" w:hAnsi="Times New Roman" w:cs="Times New Roman"/>
+          <w:b/>
+          <w:bCs/>
+          <w:kern w:val="0"/>
+          <w:sz w:val="27"/>
+          <w:szCs w:val="27"/>
+          <w:lang w:eastAsia="es-ES"/>
+          <w14:ligatures w14:val="none"/>
+        </w:rPr>
+        <w:t>React</w:t>
+      </w:r>
+      <w:proofErr w:type="spellEnd"/>
+      <w:r>
+        <w:rPr>
+          <w:rFonts w:ascii="Times New Roman" w:eastAsia="Times New Roman" w:hAnsi="Times New Roman" w:cs="Times New Roman"/>
+          <w:b/>
+          <w:bCs/>
+          <w:kern w:val="0"/>
+          <w:sz w:val="27"/>
+          <w:szCs w:val="27"/>
+          <w:lang w:eastAsia="es-ES"/>
+          <w14:ligatures w14:val="none"/>
+        </w:rPr>
+        <w:t xml:space="preserve"> &amp; </w:t>
+      </w:r>
+      <w:proofErr w:type="spellStart"/>
+      <w:r>
+        <w:rPr>
+          <w:rFonts w:ascii="Times New Roman" w:eastAsia="Times New Roman" w:hAnsi="Times New Roman" w:cs="Times New Roman"/>
+          <w:b/>
+          <w:bCs/>
+          <w:kern w:val="0"/>
+          <w:sz w:val="27"/>
+          <w:szCs w:val="27"/>
+          <w:lang w:eastAsia="es-ES"/>
+          <w14:ligatures w14:val="none"/>
+        </w:rPr>
+        <w:t>Tailwind</w:t>
+      </w:r>
+      <w:proofErr w:type="spellEnd"/>
+      <w:r>
+        <w:rPr>
+          <w:rFonts w:ascii="Times New Roman" w:eastAsia="Times New Roman" w:hAnsi="Times New Roman" w:cs="Times New Roman"/>
+          <w:b/>
+          <w:bCs/>
+          <w:kern w:val="0"/>
+          <w:sz w:val="27"/>
+          <w:szCs w:val="27"/>
+          <w:lang w:eastAsia="es-ES"/>
+          <w14:ligatures w14:val="none"/>
+        </w:rPr>
+        <w:t>)</w:t>
+      </w:r>
+    </w:p>
+    <w:p>
+      <w:pPr>
+        <w:spacing w:before="100" w:beforeAutospacing="1" w:after="100" w:afterAutospacing="1" w:line="240" w:lineRule="auto"/>
+        <w:rPr>
+          <w:rFonts w:ascii="Times New Roman" w:eastAsia="Times New Roman" w:hAnsi="Times New Roman" w:cs="Times New Roman"/>
+          <w:kern w:val="0"/>
+          <w:lang w:eastAsia="es-ES"/>
+          <w14:ligatures w14:val="none"/>
+        </w:rPr>
+      </w:pPr>
+      <w:r>
+        <w:rPr>
+          <w:rFonts w:ascii="Times New Roman" w:eastAsia="Times New Roman" w:hAnsi="Times New Roman" w:cs="Times New Roman"/>
+          <w:b/>
+          <w:bCs/>
+          <w:kern w:val="0"/>
+          <w:lang w:eastAsia="es-ES"/>
+          <w14:ligatures w14:val="none"/>
+        </w:rPr>
+        <w:t xml:space="preserve">2.1.- Inicialización del </w:t>
+      </w:r>
+      <w:proofErr w:type="spellStart"/>
+      <w:r>
+        <w:rPr>
+          <w:rFonts w:ascii="Times New Roman" w:eastAsia="Times New Roman" w:hAnsi="Times New Roman" w:cs="Times New Roman"/>
+          <w:b/>
+          <w:bCs/>
+          <w:kern w:val="0"/>
+          <w:lang w:eastAsia="es-ES"/>
+          <w14:ligatures w14:val="none"/>
+        </w:rPr>
+        <w:t>Frontend</w:t>
+      </w:r>
+      <w:proofErr w:type="spellEnd"/>
+      <w:r>
+        <w:rPr>
+          <w:rFonts w:ascii="Times New Roman" w:eastAsia="Times New Roman" w:hAnsi="Times New Roman" w:cs="Times New Roman"/>
+          <w:b/>
+          <w:bCs/>
+          <w:kern w:val="0"/>
+          <w:lang w:eastAsia="es-ES"/>
+          <w14:ligatures w14:val="none"/>
+        </w:rPr>
+        <w:t xml:space="preserve"> (Vite y Axios)</w:t>
+      </w:r>
+      <w:r>
+        <w:rPr>
+          <w:rFonts w:ascii="Times New Roman" w:eastAsia="Times New Roman" w:hAnsi="Times New Roman" w:cs="Times New Roman"/>
+          <w:kern w:val="0"/>
+          <w:lang w:eastAsia="es-ES"/>
+          <w14:ligatures w14:val="none"/>
+        </w:rPr>
+        <w:t xml:space="preserve"> Para mantener la arquitectura completamente desacoplada de la API, creamos un proyecto de </w:t>
+      </w:r>
+      <w:proofErr w:type="spellStart"/>
+      <w:r>
+        <w:rPr>
+          <w:rFonts w:ascii="Times New Roman" w:eastAsia="Times New Roman" w:hAnsi="Times New Roman" w:cs="Times New Roman"/>
+          <w:kern w:val="0"/>
+          <w:lang w:eastAsia="es-ES"/>
+          <w14:ligatures w14:val="none"/>
+        </w:rPr>
+        <w:t>React</w:t>
+      </w:r>
+      <w:proofErr w:type="spellEnd"/>
+      <w:r>
+        <w:rPr>
+          <w:rFonts w:ascii="Times New Roman" w:eastAsia="Times New Roman" w:hAnsi="Times New Roman" w:cs="Times New Roman"/>
+          <w:kern w:val="0"/>
+          <w:lang w:eastAsia="es-ES"/>
+          <w14:ligatures w14:val="none"/>
+        </w:rPr>
+        <w:t xml:space="preserve"> independiente utilizando Vite (</w:t>
+      </w:r>
+      <w:proofErr w:type="spellStart"/>
+      <w:r>
+        <w:rPr>
+          <w:rFonts w:ascii="Courier New" w:eastAsia="Times New Roman" w:hAnsi="Courier New" w:cs="Courier New"/>
+          <w:kern w:val="0"/>
+          <w:sz w:val="20"/>
+          <w:szCs w:val="20"/>
+          <w:lang w:eastAsia="es-ES"/>
+          <w14:ligatures w14:val="none"/>
+        </w:rPr>
+        <w:t>npm</w:t>
+      </w:r>
+      <w:proofErr w:type="spellEnd"/>
+      <w:r>
+        <w:rPr>
+          <w:rFonts w:ascii="Courier New" w:eastAsia="Times New Roman" w:hAnsi="Courier New" w:cs="Courier New"/>
+          <w:kern w:val="0"/>
+          <w:sz w:val="20"/>
+          <w:szCs w:val="20"/>
+          <w:lang w:eastAsia="es-ES"/>
+          <w14:ligatures w14:val="none"/>
+        </w:rPr>
+        <w:t xml:space="preserve"> </w:t>
+      </w:r>
+      <w:proofErr w:type="spellStart"/>
+      <w:r>
+        <w:rPr>
+          <w:rFonts w:ascii="Courier New" w:eastAsia="Times New Roman" w:hAnsi="Courier New" w:cs="Courier New"/>
+          <w:kern w:val="0"/>
+          <w:sz w:val="20"/>
+          <w:szCs w:val="20"/>
+          <w:lang w:eastAsia="es-ES"/>
+          <w14:ligatures w14:val="none"/>
+        </w:rPr>
+        <w:t>create</w:t>
+      </w:r>
+      <w:proofErr w:type="spellEnd"/>
+      <w:r>
+        <w:rPr>
+          <w:rFonts w:ascii="Courier New" w:eastAsia="Times New Roman" w:hAnsi="Courier New" w:cs="Courier New"/>
+          <w:kern w:val="0"/>
+          <w:sz w:val="20"/>
+          <w:szCs w:val="20"/>
+          <w:lang w:eastAsia="es-ES"/>
+          <w14:ligatures w14:val="none"/>
+        </w:rPr>
+        <w:t xml:space="preserve"> </w:t>
+      </w:r>
+      <w:proofErr w:type="spellStart"/>
+      <w:r>
+        <w:rPr>
+          <w:rFonts w:ascii="Courier New" w:eastAsia="Times New Roman" w:hAnsi="Courier New" w:cs="Courier New"/>
+          <w:kern w:val="0"/>
+          <w:sz w:val="20"/>
+          <w:szCs w:val="20"/>
+          <w:lang w:eastAsia="es-ES"/>
+          <w14:ligatures w14:val="none"/>
+        </w:rPr>
+        <w:t>vite@latest</w:t>
+      </w:r>
+      <w:proofErr w:type="spellEnd"/>
+      <w:r>
+        <w:rPr>
+          <w:rFonts w:ascii="Times New Roman" w:eastAsia="Times New Roman" w:hAnsi="Times New Roman" w:cs="Times New Roman"/>
+          <w:kern w:val="0"/>
+          <w:lang w:eastAsia="es-ES"/>
+          <w14:ligatures w14:val="none"/>
+        </w:rPr>
+        <w:t xml:space="preserve">) en una carpeta separada de Laravel. Instalamos dependencias clave como </w:t>
+      </w:r>
+      <w:proofErr w:type="spellStart"/>
+      <w:r>
+        <w:rPr>
+          <w:rFonts w:ascii="Courier New" w:eastAsia="Times New Roman" w:hAnsi="Courier New" w:cs="Courier New"/>
+          <w:kern w:val="0"/>
+          <w:sz w:val="20"/>
+          <w:szCs w:val="20"/>
+          <w:lang w:eastAsia="es-ES"/>
+          <w14:ligatures w14:val="none"/>
+        </w:rPr>
+        <w:t>react</w:t>
+      </w:r>
+      <w:proofErr w:type="spellEnd"/>
+      <w:r>
+        <w:rPr>
+          <w:rFonts w:ascii="Courier New" w:eastAsia="Times New Roman" w:hAnsi="Courier New" w:cs="Courier New"/>
+          <w:kern w:val="0"/>
+          <w:sz w:val="20"/>
+          <w:szCs w:val="20"/>
+          <w:lang w:eastAsia="es-ES"/>
+          <w14:ligatures w14:val="none"/>
+        </w:rPr>
+        <w:t>-</w:t>
+      </w:r>
+      <w:proofErr w:type="spellStart"/>
+      <w:r>
+        <w:rPr>
+          <w:rFonts w:ascii="Courier New" w:eastAsia="Times New Roman" w:hAnsi="Courier New" w:cs="Courier New"/>
+          <w:kern w:val="0"/>
+          <w:sz w:val="20"/>
+          <w:szCs w:val="20"/>
+          <w:lang w:eastAsia="es-ES"/>
+          <w14:ligatures w14:val="none"/>
+        </w:rPr>
+        <w:t>router</w:t>
+      </w:r>
+      <w:proofErr w:type="spellEnd"/>
+      <w:r>
+        <w:rPr>
+          <w:rFonts w:ascii="Courier New" w:eastAsia="Times New Roman" w:hAnsi="Courier New" w:cs="Courier New"/>
+          <w:kern w:val="0"/>
+          <w:sz w:val="20"/>
+          <w:szCs w:val="20"/>
+          <w:lang w:eastAsia="es-ES"/>
+          <w14:ligatures w14:val="none"/>
+        </w:rPr>
+        <w:t>-dom</w:t>
+      </w:r>
+      <w:r>
+        <w:rPr>
+          <w:rFonts w:ascii="Times New Roman" w:eastAsia="Times New Roman" w:hAnsi="Times New Roman" w:cs="Times New Roman"/>
+          <w:kern w:val="0"/>
+          <w:lang w:eastAsia="es-ES"/>
+          <w14:ligatures w14:val="none"/>
+        </w:rPr>
+        <w:t xml:space="preserve"> y </w:t>
+      </w:r>
+      <w:proofErr w:type="spellStart"/>
+      <w:r>
+        <w:rPr>
+          <w:rFonts w:ascii="Courier New" w:eastAsia="Times New Roman" w:hAnsi="Courier New" w:cs="Courier New"/>
+          <w:kern w:val="0"/>
+          <w:sz w:val="20"/>
+          <w:szCs w:val="20"/>
+          <w:lang w:eastAsia="es-ES"/>
+          <w14:ligatures w14:val="none"/>
+        </w:rPr>
+        <w:t>axios</w:t>
+      </w:r>
+      <w:proofErr w:type="spellEnd"/>
+      <w:r>
+        <w:rPr>
+          <w:rFonts w:ascii="Times New Roman" w:eastAsia="Times New Roman" w:hAnsi="Times New Roman" w:cs="Times New Roman"/>
+          <w:kern w:val="0"/>
+          <w:lang w:eastAsia="es-ES"/>
+          <w14:ligatures w14:val="none"/>
+        </w:rPr>
+        <w:t xml:space="preserve">. Para lograr que el </w:t>
+      </w:r>
+      <w:proofErr w:type="spellStart"/>
+      <w:r>
+        <w:rPr>
+          <w:rFonts w:ascii="Times New Roman" w:eastAsia="Times New Roman" w:hAnsi="Times New Roman" w:cs="Times New Roman"/>
+          <w:kern w:val="0"/>
+          <w:lang w:eastAsia="es-ES"/>
+          <w14:ligatures w14:val="none"/>
+        </w:rPr>
+        <w:t>frontend</w:t>
+      </w:r>
+      <w:proofErr w:type="spellEnd"/>
+      <w:r>
+        <w:rPr>
+          <w:rFonts w:ascii="Times New Roman" w:eastAsia="Times New Roman" w:hAnsi="Times New Roman" w:cs="Times New Roman"/>
+          <w:kern w:val="0"/>
+          <w:lang w:eastAsia="es-ES"/>
+          <w14:ligatures w14:val="none"/>
+        </w:rPr>
+        <w:t xml:space="preserve"> se comunique correctamente con la seguridad de Laravel </w:t>
+      </w:r>
+      <w:proofErr w:type="spellStart"/>
+      <w:r>
+        <w:rPr>
+          <w:rFonts w:ascii="Times New Roman" w:eastAsia="Times New Roman" w:hAnsi="Times New Roman" w:cs="Times New Roman"/>
+          <w:kern w:val="0"/>
+          <w:lang w:eastAsia="es-ES"/>
+          <w14:ligatures w14:val="none"/>
+        </w:rPr>
+        <w:t>Sanctum</w:t>
+      </w:r>
+      <w:proofErr w:type="spellEnd"/>
+      <w:r>
+        <w:rPr>
+          <w:rFonts w:ascii="Times New Roman" w:eastAsia="Times New Roman" w:hAnsi="Times New Roman" w:cs="Times New Roman"/>
+          <w:kern w:val="0"/>
+          <w:lang w:eastAsia="es-ES"/>
+          <w14:ligatures w14:val="none"/>
+        </w:rPr>
+        <w:t xml:space="preserve">, configuramos una instancia global de Axios en la que activamos </w:t>
+      </w:r>
+      <w:proofErr w:type="spellStart"/>
+      <w:r>
+        <w:rPr>
+          <w:rFonts w:ascii="Courier New" w:eastAsia="Times New Roman" w:hAnsi="Courier New" w:cs="Courier New"/>
+          <w:kern w:val="0"/>
+          <w:sz w:val="20"/>
+          <w:szCs w:val="20"/>
+          <w:lang w:eastAsia="es-ES"/>
+          <w14:ligatures w14:val="none"/>
+        </w:rPr>
+        <w:t>withCredentials</w:t>
+      </w:r>
+      <w:proofErr w:type="spellEnd"/>
+      <w:r>
+        <w:rPr>
+          <w:rFonts w:ascii="Courier New" w:eastAsia="Times New Roman" w:hAnsi="Courier New" w:cs="Courier New"/>
+          <w:kern w:val="0"/>
+          <w:sz w:val="20"/>
+          <w:szCs w:val="20"/>
+          <w:lang w:eastAsia="es-ES"/>
+          <w14:ligatures w14:val="none"/>
+        </w:rPr>
+        <w:t>: true</w:t>
+      </w:r>
+      <w:r>
+        <w:rPr>
+          <w:rFonts w:ascii="Times New Roman" w:eastAsia="Times New Roman" w:hAnsi="Times New Roman" w:cs="Times New Roman"/>
+          <w:kern w:val="0"/>
+          <w:lang w:eastAsia="es-ES"/>
+          <w14:ligatures w14:val="none"/>
+        </w:rPr>
+        <w:t xml:space="preserve">. Además, para solucionar problemas de bloqueo del token CSRF en las versiones recientes de Axios (1.x+), añadimos la configuración crucial </w:t>
+      </w:r>
+      <w:proofErr w:type="spellStart"/>
+      <w:r>
+        <w:rPr>
+          <w:rFonts w:ascii="Courier New" w:eastAsia="Times New Roman" w:hAnsi="Courier New" w:cs="Courier New"/>
+          <w:kern w:val="0"/>
+          <w:sz w:val="20"/>
+          <w:szCs w:val="20"/>
+          <w:lang w:eastAsia="es-ES"/>
+          <w14:ligatures w14:val="none"/>
+        </w:rPr>
+        <w:t>withXSRFToken</w:t>
+      </w:r>
+      <w:proofErr w:type="spellEnd"/>
+      <w:r>
+        <w:rPr>
+          <w:rFonts w:ascii="Courier New" w:eastAsia="Times New Roman" w:hAnsi="Courier New" w:cs="Courier New"/>
+          <w:kern w:val="0"/>
+          <w:sz w:val="20"/>
+          <w:szCs w:val="20"/>
+          <w:lang w:eastAsia="es-ES"/>
+          <w14:ligatures w14:val="none"/>
+        </w:rPr>
+        <w:t>: true</w:t>
+      </w:r>
+      <w:r>
+        <w:rPr>
+          <w:rFonts w:ascii="Times New Roman" w:eastAsia="Times New Roman" w:hAnsi="Times New Roman" w:cs="Times New Roman"/>
+          <w:kern w:val="0"/>
+          <w:lang w:eastAsia="es-ES"/>
+          <w14:ligatures w14:val="none"/>
+        </w:rPr>
+        <w:t>.</w:t>
+      </w:r>
+    </w:p>
+    <w:p>
+      <w:pPr>
+        <w:spacing w:before="100" w:beforeAutospacing="1" w:after="100" w:afterAutospacing="1" w:line="240" w:lineRule="auto"/>
+        <w:rPr>
+          <w:rFonts w:ascii="Times New Roman" w:eastAsia="Times New Roman" w:hAnsi="Times New Roman" w:cs="Times New Roman"/>
+          <w:kern w:val="0"/>
+          <w:lang w:eastAsia="es-ES"/>
+          <w14:ligatures w14:val="none"/>
+        </w:rPr>
+      </w:pPr>
+      <w:r>
+        <w:rPr>
+          <w:rFonts w:ascii="Times New Roman" w:eastAsia="Times New Roman" w:hAnsi="Times New Roman" w:cs="Times New Roman"/>
+          <w:b/>
+          <w:bCs/>
+          <w:kern w:val="0"/>
+          <w:lang w:eastAsia="es-ES"/>
+          <w14:ligatures w14:val="none"/>
+        </w:rPr>
+        <w:t>2.2.- Ajustes Críticos de Autenticación (Laravel 11)</w:t>
+      </w:r>
+      <w:r>
+        <w:rPr>
+          <w:rFonts w:ascii="Times New Roman" w:eastAsia="Times New Roman" w:hAnsi="Times New Roman" w:cs="Times New Roman"/>
+          <w:kern w:val="0"/>
+          <w:lang w:eastAsia="es-ES"/>
+          <w14:ligatures w14:val="none"/>
+        </w:rPr>
+        <w:t xml:space="preserve"> Al intentar conectar Front y Back, nos topamos con las estrictas medidas de seguridad de Laravel 11. Tuvimos que realizar varios ajustes para que el </w:t>
+      </w:r>
+      <w:proofErr w:type="spellStart"/>
+      <w:r>
+        <w:rPr>
+          <w:rFonts w:ascii="Times New Roman" w:eastAsia="Times New Roman" w:hAnsi="Times New Roman" w:cs="Times New Roman"/>
+          <w:kern w:val="0"/>
+          <w:lang w:eastAsia="es-ES"/>
+          <w14:ligatures w14:val="none"/>
+        </w:rPr>
+        <w:t>login</w:t>
+      </w:r>
+      <w:proofErr w:type="spellEnd"/>
+      <w:r>
+        <w:rPr>
+          <w:rFonts w:ascii="Times New Roman" w:eastAsia="Times New Roman" w:hAnsi="Times New Roman" w:cs="Times New Roman"/>
+          <w:kern w:val="0"/>
+          <w:lang w:eastAsia="es-ES"/>
+          <w14:ligatures w14:val="none"/>
+        </w:rPr>
+        <w:t xml:space="preserve"> funcionara:</w:t>
+      </w:r>
+    </w:p>
+    <w:p>
+      <w:pPr>
+        <w:numPr>
+          <w:ilvl w:val="0"/>
+          <w:numId w:val="14"/>
+        </w:numPr>
+        <w:spacing w:before="100" w:beforeAutospacing="1" w:after="100" w:afterAutospacing="1" w:line="240" w:lineRule="auto"/>
+        <w:rPr>
+          <w:rFonts w:ascii="Times New Roman" w:eastAsia="Times New Roman" w:hAnsi="Times New Roman" w:cs="Times New Roman"/>
+          <w:kern w:val="0"/>
+          <w:lang w:eastAsia="es-ES"/>
+          <w14:ligatures w14:val="none"/>
+        </w:rPr>
+      </w:pPr>
+      <w:r>
+        <w:rPr>
+          <w:rFonts w:ascii="Times New Roman" w:eastAsia="Times New Roman" w:hAnsi="Times New Roman" w:cs="Times New Roman"/>
+          <w:b/>
+          <w:bCs/>
+          <w:kern w:val="0"/>
+          <w:lang w:eastAsia="es-ES"/>
+          <w14:ligatures w14:val="none"/>
+        </w:rPr>
+        <w:t>Login por DNI:</w:t>
+      </w:r>
+      <w:r>
+        <w:rPr>
+          <w:rFonts w:ascii="Times New Roman" w:eastAsia="Times New Roman" w:hAnsi="Times New Roman" w:cs="Times New Roman"/>
+          <w:kern w:val="0"/>
+          <w:lang w:eastAsia="es-ES"/>
+          <w14:ligatures w14:val="none"/>
+        </w:rPr>
+        <w:t xml:space="preserve"> Modificamos el </w:t>
+      </w:r>
+      <w:proofErr w:type="spellStart"/>
+      <w:r>
+        <w:rPr>
+          <w:rFonts w:ascii="Courier New" w:eastAsia="Times New Roman" w:hAnsi="Courier New" w:cs="Courier New"/>
+          <w:kern w:val="0"/>
+          <w:sz w:val="20"/>
+          <w:szCs w:val="20"/>
+          <w:lang w:eastAsia="es-ES"/>
+          <w14:ligatures w14:val="none"/>
+        </w:rPr>
+        <w:t>AuthController</w:t>
+      </w:r>
+      <w:proofErr w:type="spellEnd"/>
+      <w:r>
+        <w:rPr>
+          <w:rFonts w:ascii="Times New Roman" w:eastAsia="Times New Roman" w:hAnsi="Times New Roman" w:cs="Times New Roman"/>
+          <w:kern w:val="0"/>
+          <w:lang w:eastAsia="es-ES"/>
+          <w14:ligatures w14:val="none"/>
+        </w:rPr>
+        <w:t xml:space="preserve"> para que la autenticación se valide usando el DNI del empleado en lugar del correo electrónico, adaptándolo a los requisitos lógicos de RRHH.</w:t>
+      </w:r>
+    </w:p>
+    <w:p>
+      <w:pPr>
+        <w:numPr>
+          <w:ilvl w:val="0"/>
+          <w:numId w:val="14"/>
+        </w:numPr>
+        <w:spacing w:before="100" w:beforeAutospacing="1" w:after="100" w:afterAutospacing="1" w:line="240" w:lineRule="auto"/>
+        <w:rPr>
+          <w:rFonts w:ascii="Times New Roman" w:eastAsia="Times New Roman" w:hAnsi="Times New Roman" w:cs="Times New Roman"/>
+          <w:kern w:val="0"/>
+          <w:lang w:eastAsia="es-ES"/>
+          <w14:ligatures w14:val="none"/>
+        </w:rPr>
+      </w:pPr>
+      <w:r>
+        <w:rPr>
+          <w:rFonts w:ascii="Times New Roman" w:eastAsia="Times New Roman" w:hAnsi="Times New Roman" w:cs="Times New Roman"/>
+          <w:b/>
+          <w:bCs/>
+          <w:kern w:val="0"/>
+          <w:lang w:eastAsia="es-ES"/>
+          <w14:ligatures w14:val="none"/>
+        </w:rPr>
+        <w:t>Configuración de sesión (.</w:t>
+      </w:r>
+      <w:proofErr w:type="spellStart"/>
+      <w:r>
+        <w:rPr>
+          <w:rFonts w:ascii="Times New Roman" w:eastAsia="Times New Roman" w:hAnsi="Times New Roman" w:cs="Times New Roman"/>
+          <w:b/>
+          <w:bCs/>
+          <w:kern w:val="0"/>
+          <w:lang w:eastAsia="es-ES"/>
+          <w14:ligatures w14:val="none"/>
+        </w:rPr>
+        <w:t>env</w:t>
+      </w:r>
+      <w:proofErr w:type="spellEnd"/>
+      <w:r>
+        <w:rPr>
+          <w:rFonts w:ascii="Times New Roman" w:eastAsia="Times New Roman" w:hAnsi="Times New Roman" w:cs="Times New Roman"/>
+          <w:b/>
+          <w:bCs/>
+          <w:kern w:val="0"/>
+          <w:lang w:eastAsia="es-ES"/>
+          <w14:ligatures w14:val="none"/>
+        </w:rPr>
+        <w:t>):</w:t>
+      </w:r>
+      <w:r>
+        <w:rPr>
+          <w:rFonts w:ascii="Times New Roman" w:eastAsia="Times New Roman" w:hAnsi="Times New Roman" w:cs="Times New Roman"/>
+          <w:kern w:val="0"/>
+          <w:lang w:eastAsia="es-ES"/>
+          <w14:ligatures w14:val="none"/>
+        </w:rPr>
+        <w:t xml:space="preserve"> Ajustamos las variables para evitar que el navegador bloqueara las cookies. Establecimos </w:t>
+      </w:r>
+      <w:r>
+        <w:rPr>
+          <w:rFonts w:ascii="Courier New" w:eastAsia="Times New Roman" w:hAnsi="Courier New" w:cs="Courier New"/>
+          <w:kern w:val="0"/>
+          <w:sz w:val="20"/>
+          <w:szCs w:val="20"/>
+          <w:lang w:eastAsia="es-ES"/>
+          <w14:ligatures w14:val="none"/>
+        </w:rPr>
+        <w:t>FRONTEND_URL=http://localhost:5173</w:t>
+      </w:r>
+      <w:r>
+        <w:rPr>
+          <w:rFonts w:ascii="Times New Roman" w:eastAsia="Times New Roman" w:hAnsi="Times New Roman" w:cs="Times New Roman"/>
+          <w:kern w:val="0"/>
+          <w:lang w:eastAsia="es-ES"/>
+          <w14:ligatures w14:val="none"/>
+        </w:rPr>
+        <w:t xml:space="preserve">, </w:t>
+      </w:r>
+      <w:r>
+        <w:rPr>
+          <w:rFonts w:ascii="Courier New" w:eastAsia="Times New Roman" w:hAnsi="Courier New" w:cs="Courier New"/>
+          <w:kern w:val="0"/>
+          <w:sz w:val="20"/>
+          <w:szCs w:val="20"/>
+          <w:lang w:eastAsia="es-ES"/>
+          <w14:ligatures w14:val="none"/>
+        </w:rPr>
+        <w:t>SANCTUM_STATEFUL_DOMAINS=localhost:5173,127.0.0.1:5173</w:t>
+      </w:r>
+      <w:r>
+        <w:rPr>
+          <w:rFonts w:ascii="Times New Roman" w:eastAsia="Times New Roman" w:hAnsi="Times New Roman" w:cs="Times New Roman"/>
+          <w:kern w:val="0"/>
+          <w:lang w:eastAsia="es-ES"/>
+          <w14:ligatures w14:val="none"/>
+        </w:rPr>
+        <w:t xml:space="preserve"> y dejamos la variable </w:t>
+      </w:r>
+      <w:r>
+        <w:rPr>
+          <w:rFonts w:ascii="Courier New" w:eastAsia="Times New Roman" w:hAnsi="Courier New" w:cs="Courier New"/>
+          <w:kern w:val="0"/>
+          <w:sz w:val="20"/>
+          <w:szCs w:val="20"/>
+          <w:lang w:eastAsia="es-ES"/>
+          <w14:ligatures w14:val="none"/>
+        </w:rPr>
+        <w:t>SESSION_DOMAIN=</w:t>
+      </w:r>
+      <w:r>
+        <w:rPr>
+          <w:rFonts w:ascii="Times New Roman" w:eastAsia="Times New Roman" w:hAnsi="Times New Roman" w:cs="Times New Roman"/>
+          <w:kern w:val="0"/>
+          <w:lang w:eastAsia="es-ES"/>
+          <w14:ligatures w14:val="none"/>
+        </w:rPr>
+        <w:t xml:space="preserve"> totalmente vacía.</w:t>
+      </w:r>
+    </w:p>
+    <w:p>
+      <w:pPr>
+        <w:numPr>
+          <w:ilvl w:val="0"/>
+          <w:numId w:val="14"/>
+        </w:numPr>
+        <w:spacing w:before="100" w:beforeAutospacing="1" w:after="100" w:afterAutospacing="1" w:line="240" w:lineRule="auto"/>
+        <w:rPr>
+          <w:rFonts w:ascii="Times New Roman" w:eastAsia="Times New Roman" w:hAnsi="Times New Roman" w:cs="Times New Roman"/>
+          <w:kern w:val="0"/>
+          <w:lang w:eastAsia="es-ES"/>
+          <w14:ligatures w14:val="none"/>
+        </w:rPr>
+      </w:pPr>
+      <w:r>
+        <w:rPr>
+          <w:rFonts w:ascii="Times New Roman" w:eastAsia="Times New Roman" w:hAnsi="Times New Roman" w:cs="Times New Roman"/>
+          <w:b/>
+          <w:bCs/>
+          <w:kern w:val="0"/>
+          <w:lang w:eastAsia="es-ES"/>
+          <w14:ligatures w14:val="none"/>
+        </w:rPr>
+        <w:t xml:space="preserve">Activación de </w:t>
+      </w:r>
+      <w:proofErr w:type="spellStart"/>
+      <w:r>
+        <w:rPr>
+          <w:rFonts w:ascii="Times New Roman" w:eastAsia="Times New Roman" w:hAnsi="Times New Roman" w:cs="Times New Roman"/>
+          <w:b/>
+          <w:bCs/>
+          <w:kern w:val="0"/>
+          <w:lang w:eastAsia="es-ES"/>
+          <w14:ligatures w14:val="none"/>
+        </w:rPr>
+        <w:t>Stateful</w:t>
+      </w:r>
+      <w:proofErr w:type="spellEnd"/>
+      <w:r>
+        <w:rPr>
+          <w:rFonts w:ascii="Times New Roman" w:eastAsia="Times New Roman" w:hAnsi="Times New Roman" w:cs="Times New Roman"/>
+          <w:b/>
+          <w:bCs/>
+          <w:kern w:val="0"/>
+          <w:lang w:eastAsia="es-ES"/>
+          <w14:ligatures w14:val="none"/>
+        </w:rPr>
+        <w:t xml:space="preserve"> API:</w:t>
+      </w:r>
+      <w:r>
+        <w:rPr>
+          <w:rFonts w:ascii="Times New Roman" w:eastAsia="Times New Roman" w:hAnsi="Times New Roman" w:cs="Times New Roman"/>
+          <w:kern w:val="0"/>
+          <w:lang w:eastAsia="es-ES"/>
+          <w14:ligatures w14:val="none"/>
+        </w:rPr>
+        <w:t xml:space="preserve"> En Laravel 11, las rutas de la API vienen sin "memoria" por defecto. Lo solucionamos editando el archivo </w:t>
+      </w:r>
+      <w:proofErr w:type="spellStart"/>
+      <w:r>
+        <w:rPr>
+          <w:rFonts w:ascii="Courier New" w:eastAsia="Times New Roman" w:hAnsi="Courier New" w:cs="Courier New"/>
+          <w:kern w:val="0"/>
+          <w:sz w:val="20"/>
+          <w:szCs w:val="20"/>
+          <w:lang w:eastAsia="es-ES"/>
+          <w14:ligatures w14:val="none"/>
+        </w:rPr>
+        <w:t>bootstrap</w:t>
+      </w:r>
+      <w:proofErr w:type="spellEnd"/>
+      <w:r>
+        <w:rPr>
+          <w:rFonts w:ascii="Courier New" w:eastAsia="Times New Roman" w:hAnsi="Courier New" w:cs="Courier New"/>
+          <w:kern w:val="0"/>
+          <w:sz w:val="20"/>
+          <w:szCs w:val="20"/>
+          <w:lang w:eastAsia="es-ES"/>
+          <w14:ligatures w14:val="none"/>
+        </w:rPr>
+        <w:t>/</w:t>
+      </w:r>
+      <w:proofErr w:type="spellStart"/>
+      <w:r>
+        <w:rPr>
+          <w:rFonts w:ascii="Courier New" w:eastAsia="Times New Roman" w:hAnsi="Courier New" w:cs="Courier New"/>
+          <w:kern w:val="0"/>
+          <w:sz w:val="20"/>
+          <w:szCs w:val="20"/>
+          <w:lang w:eastAsia="es-ES"/>
+          <w14:ligatures w14:val="none"/>
+        </w:rPr>
+        <w:t>app.php</w:t>
+      </w:r>
+      <w:proofErr w:type="spellEnd"/>
+      <w:r>
+        <w:rPr>
+          <w:rFonts w:ascii="Times New Roman" w:eastAsia="Times New Roman" w:hAnsi="Times New Roman" w:cs="Times New Roman"/>
+          <w:kern w:val="0"/>
+          <w:lang w:eastAsia="es-ES"/>
+          <w14:ligatures w14:val="none"/>
+        </w:rPr>
+        <w:t xml:space="preserve"> y añadiendo </w:t>
+      </w:r>
+      <w:r>
+        <w:rPr>
+          <w:rFonts w:ascii="Courier New" w:eastAsia="Times New Roman" w:hAnsi="Courier New" w:cs="Courier New"/>
+          <w:kern w:val="0"/>
+          <w:sz w:val="20"/>
+          <w:szCs w:val="20"/>
+          <w:lang w:eastAsia="es-ES"/>
+          <w14:ligatures w14:val="none"/>
+        </w:rPr>
+        <w:t>$middleware-&gt;</w:t>
+      </w:r>
+      <w:proofErr w:type="spellStart"/>
+      <w:proofErr w:type="gramStart"/>
+      <w:r>
+        <w:rPr>
+          <w:rFonts w:ascii="Courier New" w:eastAsia="Times New Roman" w:hAnsi="Courier New" w:cs="Courier New"/>
+          <w:kern w:val="0"/>
+          <w:sz w:val="20"/>
+          <w:szCs w:val="20"/>
+          <w:lang w:eastAsia="es-ES"/>
+          <w14:ligatures w14:val="none"/>
+        </w:rPr>
+        <w:t>statefulApi</w:t>
+      </w:r>
+      <w:proofErr w:type="spellEnd"/>
+      <w:r>
+        <w:rPr>
+          <w:rFonts w:ascii="Courier New" w:eastAsia="Times New Roman" w:hAnsi="Courier New" w:cs="Courier New"/>
+          <w:kern w:val="0"/>
+          <w:sz w:val="20"/>
+          <w:szCs w:val="20"/>
+          <w:lang w:eastAsia="es-ES"/>
+          <w14:ligatures w14:val="none"/>
+        </w:rPr>
+        <w:t>(</w:t>
+      </w:r>
+      <w:proofErr w:type="gramEnd"/>
+      <w:r>
+        <w:rPr>
+          <w:rFonts w:ascii="Courier New" w:eastAsia="Times New Roman" w:hAnsi="Courier New" w:cs="Courier New"/>
+          <w:kern w:val="0"/>
+          <w:sz w:val="20"/>
+          <w:szCs w:val="20"/>
+          <w:lang w:eastAsia="es-ES"/>
+          <w14:ligatures w14:val="none"/>
+        </w:rPr>
+        <w:t>)</w:t>
+      </w:r>
+      <w:r>
+        <w:rPr>
+          <w:rFonts w:ascii="Times New Roman" w:eastAsia="Times New Roman" w:hAnsi="Times New Roman" w:cs="Times New Roman"/>
+          <w:kern w:val="0"/>
+          <w:lang w:eastAsia="es-ES"/>
+          <w14:ligatures w14:val="none"/>
+        </w:rPr>
+        <w:t xml:space="preserve"> para obligar a Laravel a recordar las cookies de sesión en las rutas API.</w:t>
+      </w:r>
+    </w:p>
+    <w:p>
+      <w:pPr>
+        <w:numPr>
+          <w:ilvl w:val="0"/>
+          <w:numId w:val="14"/>
+        </w:numPr>
+        <w:spacing w:before="100" w:beforeAutospacing="1" w:after="100" w:afterAutospacing="1" w:line="240" w:lineRule="auto"/>
+        <w:rPr>
+          <w:rFonts w:ascii="Times New Roman" w:eastAsia="Times New Roman" w:hAnsi="Times New Roman" w:cs="Times New Roman"/>
+          <w:kern w:val="0"/>
+          <w:lang w:eastAsia="es-ES"/>
+          <w14:ligatures w14:val="none"/>
+        </w:rPr>
+      </w:pPr>
+      <w:r>
+        <w:rPr>
+          <w:rFonts w:ascii="Times New Roman" w:eastAsia="Times New Roman" w:hAnsi="Times New Roman" w:cs="Times New Roman"/>
+          <w:b/>
+          <w:bCs/>
+          <w:kern w:val="0"/>
+          <w:lang w:eastAsia="es-ES"/>
+          <w14:ligatures w14:val="none"/>
+        </w:rPr>
+        <w:t>CORS:</w:t>
+      </w:r>
+      <w:r>
+        <w:rPr>
+          <w:rFonts w:ascii="Times New Roman" w:eastAsia="Times New Roman" w:hAnsi="Times New Roman" w:cs="Times New Roman"/>
+          <w:kern w:val="0"/>
+          <w:lang w:eastAsia="es-ES"/>
+          <w14:ligatures w14:val="none"/>
+        </w:rPr>
+        <w:t xml:space="preserve"> Publicamos la configuración de CORS y activamos </w:t>
+      </w:r>
+      <w:r>
+        <w:rPr>
+          <w:rFonts w:ascii="Courier New" w:eastAsia="Times New Roman" w:hAnsi="Courier New" w:cs="Courier New"/>
+          <w:kern w:val="0"/>
+          <w:sz w:val="20"/>
+          <w:szCs w:val="20"/>
+          <w:lang w:eastAsia="es-ES"/>
+          <w14:ligatures w14:val="none"/>
+        </w:rPr>
+        <w:t>'</w:t>
+      </w:r>
+      <w:proofErr w:type="spellStart"/>
+      <w:r>
+        <w:rPr>
+          <w:rFonts w:ascii="Courier New" w:eastAsia="Times New Roman" w:hAnsi="Courier New" w:cs="Courier New"/>
+          <w:kern w:val="0"/>
+          <w:sz w:val="20"/>
+          <w:szCs w:val="20"/>
+          <w:lang w:eastAsia="es-ES"/>
+          <w14:ligatures w14:val="none"/>
+        </w:rPr>
+        <w:t>supports_credentials</w:t>
+      </w:r>
+      <w:proofErr w:type="spellEnd"/>
+      <w:r>
+        <w:rPr>
+          <w:rFonts w:ascii="Courier New" w:eastAsia="Times New Roman" w:hAnsi="Courier New" w:cs="Courier New"/>
+          <w:kern w:val="0"/>
+          <w:sz w:val="20"/>
+          <w:szCs w:val="20"/>
+          <w:lang w:eastAsia="es-ES"/>
+          <w14:ligatures w14:val="none"/>
+        </w:rPr>
+        <w:t>' =&gt; true</w:t>
+      </w:r>
+      <w:r>
+        <w:rPr>
+          <w:rFonts w:ascii="Times New Roman" w:eastAsia="Times New Roman" w:hAnsi="Times New Roman" w:cs="Times New Roman"/>
+          <w:kern w:val="0"/>
+          <w:lang w:eastAsia="es-ES"/>
+          <w14:ligatures w14:val="none"/>
+        </w:rPr>
+        <w:t xml:space="preserve"> para que Laravel acepte las credenciales enviadas desde el puerto de </w:t>
+      </w:r>
+      <w:proofErr w:type="spellStart"/>
+      <w:r>
+        <w:rPr>
+          <w:rFonts w:ascii="Times New Roman" w:eastAsia="Times New Roman" w:hAnsi="Times New Roman" w:cs="Times New Roman"/>
+          <w:kern w:val="0"/>
+          <w:lang w:eastAsia="es-ES"/>
+          <w14:ligatures w14:val="none"/>
+        </w:rPr>
+        <w:t>React</w:t>
+      </w:r>
+      <w:proofErr w:type="spellEnd"/>
+      <w:r>
+        <w:rPr>
+          <w:rFonts w:ascii="Times New Roman" w:eastAsia="Times New Roman" w:hAnsi="Times New Roman" w:cs="Times New Roman"/>
+          <w:kern w:val="0"/>
+          <w:lang w:eastAsia="es-ES"/>
+          <w14:ligatures w14:val="none"/>
+        </w:rPr>
+        <w:t>.</w:t>
+      </w:r>
+    </w:p>
+    <w:p>
+      <w:pPr>
+        <w:spacing w:before="100" w:beforeAutospacing="1" w:after="100" w:afterAutospacing="1" w:line="240" w:lineRule="auto"/>
+        <w:rPr>
+          <w:rFonts w:ascii="Times New Roman" w:eastAsia="Times New Roman" w:hAnsi="Times New Roman" w:cs="Times New Roman"/>
+          <w:kern w:val="0"/>
+          <w:lang w:eastAsia="es-ES"/>
+          <w14:ligatures w14:val="none"/>
+        </w:rPr>
+      </w:pPr>
+      <w:r>
+        <w:rPr>
+          <w:rFonts w:ascii="Times New Roman" w:eastAsia="Times New Roman" w:hAnsi="Times New Roman" w:cs="Times New Roman"/>
+          <w:b/>
+          <w:bCs/>
+          <w:kern w:val="0"/>
+          <w:lang w:eastAsia="es-ES"/>
+          <w14:ligatures w14:val="none"/>
+        </w:rPr>
+        <w:t>2.3.- Arquitectura SPA, Rutas y Estado Global</w:t>
+      </w:r>
+      <w:r>
+        <w:rPr>
+          <w:rFonts w:ascii="Times New Roman" w:eastAsia="Times New Roman" w:hAnsi="Times New Roman" w:cs="Times New Roman"/>
+          <w:kern w:val="0"/>
+          <w:lang w:eastAsia="es-ES"/>
+          <w14:ligatures w14:val="none"/>
+        </w:rPr>
+        <w:t xml:space="preserve"> Para que la aplicación funcione como una SPA (</w:t>
+      </w:r>
+      <w:proofErr w:type="gramStart"/>
+      <w:r>
+        <w:rPr>
+          <w:rFonts w:ascii="Times New Roman" w:eastAsia="Times New Roman" w:hAnsi="Times New Roman" w:cs="Times New Roman"/>
+          <w:kern w:val="0"/>
+          <w:lang w:eastAsia="es-ES"/>
+          <w14:ligatures w14:val="none"/>
+        </w:rPr>
+        <w:t>Single</w:t>
+      </w:r>
+      <w:proofErr w:type="gramEnd"/>
+      <w:r>
+        <w:rPr>
+          <w:rFonts w:ascii="Times New Roman" w:eastAsia="Times New Roman" w:hAnsi="Times New Roman" w:cs="Times New Roman"/>
+          <w:kern w:val="0"/>
+          <w:lang w:eastAsia="es-ES"/>
+          <w14:ligatures w14:val="none"/>
+        </w:rPr>
+        <w:t xml:space="preserve"> Page </w:t>
+      </w:r>
+      <w:proofErr w:type="spellStart"/>
+      <w:r>
+        <w:rPr>
+          <w:rFonts w:ascii="Times New Roman" w:eastAsia="Times New Roman" w:hAnsi="Times New Roman" w:cs="Times New Roman"/>
+          <w:kern w:val="0"/>
+          <w:lang w:eastAsia="es-ES"/>
+          <w14:ligatures w14:val="none"/>
+        </w:rPr>
+        <w:t>Application</w:t>
+      </w:r>
+      <w:proofErr w:type="spellEnd"/>
+      <w:r>
+        <w:rPr>
+          <w:rFonts w:ascii="Times New Roman" w:eastAsia="Times New Roman" w:hAnsi="Times New Roman" w:cs="Times New Roman"/>
+          <w:kern w:val="0"/>
+          <w:lang w:eastAsia="es-ES"/>
+          <w14:ligatures w14:val="none"/>
+        </w:rPr>
+        <w:t>) real y no pierda la sesión del usuario al recargar la página, implementamos dos sistemas:</w:t>
+      </w:r>
+    </w:p>
+    <w:p>
+      <w:pPr>
+        <w:numPr>
+          <w:ilvl w:val="0"/>
+          <w:numId w:val="15"/>
+        </w:numPr>
+        <w:spacing w:before="100" w:beforeAutospacing="1" w:after="100" w:afterAutospacing="1" w:line="240" w:lineRule="auto"/>
+        <w:rPr>
+          <w:rFonts w:ascii="Times New Roman" w:eastAsia="Times New Roman" w:hAnsi="Times New Roman" w:cs="Times New Roman"/>
+          <w:kern w:val="0"/>
+          <w:lang w:eastAsia="es-ES"/>
+          <w14:ligatures w14:val="none"/>
+        </w:rPr>
+      </w:pPr>
+      <w:proofErr w:type="spellStart"/>
+      <w:r>
+        <w:rPr>
+          <w:rFonts w:ascii="Times New Roman" w:eastAsia="Times New Roman" w:hAnsi="Times New Roman" w:cs="Times New Roman"/>
+          <w:b/>
+          <w:bCs/>
+          <w:kern w:val="0"/>
+          <w:lang w:eastAsia="es-ES"/>
+          <w14:ligatures w14:val="none"/>
+        </w:rPr>
+        <w:t>Context</w:t>
+      </w:r>
+      <w:proofErr w:type="spellEnd"/>
+      <w:r>
+        <w:rPr>
+          <w:rFonts w:ascii="Times New Roman" w:eastAsia="Times New Roman" w:hAnsi="Times New Roman" w:cs="Times New Roman"/>
+          <w:b/>
+          <w:bCs/>
+          <w:kern w:val="0"/>
+          <w:lang w:eastAsia="es-ES"/>
+          <w14:ligatures w14:val="none"/>
+        </w:rPr>
+        <w:t xml:space="preserve"> API (</w:t>
+      </w:r>
+      <w:proofErr w:type="spellStart"/>
+      <w:r>
+        <w:rPr>
+          <w:rFonts w:ascii="Courier New" w:eastAsia="Times New Roman" w:hAnsi="Courier New" w:cs="Courier New"/>
+          <w:b/>
+          <w:bCs/>
+          <w:kern w:val="0"/>
+          <w:sz w:val="20"/>
+          <w:szCs w:val="20"/>
+          <w:lang w:eastAsia="es-ES"/>
+          <w14:ligatures w14:val="none"/>
+        </w:rPr>
+        <w:t>AuthContext</w:t>
+      </w:r>
+      <w:proofErr w:type="spellEnd"/>
+      <w:r>
+        <w:rPr>
+          <w:rFonts w:ascii="Times New Roman" w:eastAsia="Times New Roman" w:hAnsi="Times New Roman" w:cs="Times New Roman"/>
+          <w:b/>
+          <w:bCs/>
+          <w:kern w:val="0"/>
+          <w:lang w:eastAsia="es-ES"/>
+          <w14:ligatures w14:val="none"/>
+        </w:rPr>
+        <w:t>):</w:t>
+      </w:r>
+      <w:r>
+        <w:rPr>
+          <w:rFonts w:ascii="Times New Roman" w:eastAsia="Times New Roman" w:hAnsi="Times New Roman" w:cs="Times New Roman"/>
+          <w:kern w:val="0"/>
+          <w:lang w:eastAsia="es-ES"/>
+          <w14:ligatures w14:val="none"/>
+        </w:rPr>
+        <w:t xml:space="preserve"> Creamos un "cerebro global" que se encarga de preguntar a Laravel (mediante </w:t>
+      </w:r>
+      <w:r>
+        <w:rPr>
+          <w:rFonts w:ascii="Courier New" w:eastAsia="Times New Roman" w:hAnsi="Courier New" w:cs="Courier New"/>
+          <w:kern w:val="0"/>
+          <w:sz w:val="20"/>
+          <w:szCs w:val="20"/>
+          <w:lang w:eastAsia="es-ES"/>
+          <w14:ligatures w14:val="none"/>
+        </w:rPr>
+        <w:t>/api/v1/</w:t>
+      </w:r>
+      <w:proofErr w:type="spellStart"/>
+      <w:r>
+        <w:rPr>
+          <w:rFonts w:ascii="Courier New" w:eastAsia="Times New Roman" w:hAnsi="Courier New" w:cs="Courier New"/>
+          <w:kern w:val="0"/>
+          <w:sz w:val="20"/>
+          <w:szCs w:val="20"/>
+          <w:lang w:eastAsia="es-ES"/>
+          <w14:ligatures w14:val="none"/>
+        </w:rPr>
+        <w:t>auth</w:t>
+      </w:r>
+      <w:proofErr w:type="spellEnd"/>
+      <w:r>
+        <w:rPr>
+          <w:rFonts w:ascii="Courier New" w:eastAsia="Times New Roman" w:hAnsi="Courier New" w:cs="Courier New"/>
+          <w:kern w:val="0"/>
+          <w:sz w:val="20"/>
+          <w:szCs w:val="20"/>
+          <w:lang w:eastAsia="es-ES"/>
+          <w14:ligatures w14:val="none"/>
+        </w:rPr>
+        <w:t>/me</w:t>
+      </w:r>
+      <w:r>
+        <w:rPr>
+          <w:rFonts w:ascii="Times New Roman" w:eastAsia="Times New Roman" w:hAnsi="Times New Roman" w:cs="Times New Roman"/>
+          <w:kern w:val="0"/>
+          <w:lang w:eastAsia="es-ES"/>
+          <w14:ligatures w14:val="none"/>
+        </w:rPr>
+        <w:t xml:space="preserve">) si la sesión sigue activa nada más abrir la página. Guarda los datos del usuario </w:t>
+      </w:r>
+      <w:proofErr w:type="spellStart"/>
+      <w:r>
+        <w:rPr>
+          <w:rFonts w:ascii="Times New Roman" w:eastAsia="Times New Roman" w:hAnsi="Times New Roman" w:cs="Times New Roman"/>
+          <w:kern w:val="0"/>
+          <w:lang w:eastAsia="es-ES"/>
+          <w14:ligatures w14:val="none"/>
+        </w:rPr>
+        <w:t>logueado</w:t>
+      </w:r>
+      <w:proofErr w:type="spellEnd"/>
+      <w:r>
+        <w:rPr>
+          <w:rFonts w:ascii="Times New Roman" w:eastAsia="Times New Roman" w:hAnsi="Times New Roman" w:cs="Times New Roman"/>
+          <w:kern w:val="0"/>
+          <w:lang w:eastAsia="es-ES"/>
+          <w14:ligatures w14:val="none"/>
+        </w:rPr>
+        <w:t xml:space="preserve"> para que cualquier componente pueda leerlos.</w:t>
+      </w:r>
+    </w:p>
+    <w:p>
+      <w:pPr>
+        <w:numPr>
+          <w:ilvl w:val="0"/>
+          <w:numId w:val="15"/>
+        </w:numPr>
+        <w:spacing w:before="100" w:beforeAutospacing="1" w:after="100" w:afterAutospacing="1" w:line="240" w:lineRule="auto"/>
+        <w:rPr>
+          <w:rFonts w:ascii="Times New Roman" w:eastAsia="Times New Roman" w:hAnsi="Times New Roman" w:cs="Times New Roman"/>
+          <w:kern w:val="0"/>
+          <w:lang w:eastAsia="es-ES"/>
+          <w14:ligatures w14:val="none"/>
+        </w:rPr>
+      </w:pPr>
+      <w:proofErr w:type="spellStart"/>
+      <w:r>
+        <w:rPr>
+          <w:rFonts w:ascii="Times New Roman" w:eastAsia="Times New Roman" w:hAnsi="Times New Roman" w:cs="Times New Roman"/>
+          <w:b/>
+          <w:bCs/>
+          <w:kern w:val="0"/>
+          <w:lang w:eastAsia="es-ES"/>
+          <w14:ligatures w14:val="none"/>
+        </w:rPr>
+        <w:t>React</w:t>
+      </w:r>
+      <w:proofErr w:type="spellEnd"/>
+      <w:r>
+        <w:rPr>
+          <w:rFonts w:ascii="Times New Roman" w:eastAsia="Times New Roman" w:hAnsi="Times New Roman" w:cs="Times New Roman"/>
+          <w:b/>
+          <w:bCs/>
+          <w:kern w:val="0"/>
+          <w:lang w:eastAsia="es-ES"/>
+          <w14:ligatures w14:val="none"/>
+        </w:rPr>
+        <w:t xml:space="preserve"> </w:t>
+      </w:r>
+      <w:proofErr w:type="spellStart"/>
+      <w:r>
+        <w:rPr>
+          <w:rFonts w:ascii="Times New Roman" w:eastAsia="Times New Roman" w:hAnsi="Times New Roman" w:cs="Times New Roman"/>
+          <w:b/>
+          <w:bCs/>
+          <w:kern w:val="0"/>
+          <w:lang w:eastAsia="es-ES"/>
+          <w14:ligatures w14:val="none"/>
+        </w:rPr>
+        <w:t>Router</w:t>
+      </w:r>
+      <w:proofErr w:type="spellEnd"/>
+      <w:r>
+        <w:rPr>
+          <w:rFonts w:ascii="Times New Roman" w:eastAsia="Times New Roman" w:hAnsi="Times New Roman" w:cs="Times New Roman"/>
+          <w:b/>
+          <w:bCs/>
+          <w:kern w:val="0"/>
+          <w:lang w:eastAsia="es-ES"/>
+          <w14:ligatures w14:val="none"/>
+        </w:rPr>
+        <w:t>:</w:t>
+      </w:r>
+      <w:r>
+        <w:rPr>
+          <w:rFonts w:ascii="Times New Roman" w:eastAsia="Times New Roman" w:hAnsi="Times New Roman" w:cs="Times New Roman"/>
+          <w:kern w:val="0"/>
+          <w:lang w:eastAsia="es-ES"/>
+          <w14:ligatures w14:val="none"/>
+        </w:rPr>
+        <w:t xml:space="preserve"> Separamos la aplicación en vistas. Creamos rutas públicas (como el </w:t>
+      </w:r>
+      <w:r>
+        <w:rPr>
+          <w:rFonts w:ascii="Courier New" w:eastAsia="Times New Roman" w:hAnsi="Courier New" w:cs="Courier New"/>
+          <w:kern w:val="0"/>
+          <w:sz w:val="20"/>
+          <w:szCs w:val="20"/>
+          <w:lang w:eastAsia="es-ES"/>
+          <w14:ligatures w14:val="none"/>
+        </w:rPr>
+        <w:t>/</w:t>
+      </w:r>
+      <w:proofErr w:type="spellStart"/>
+      <w:r>
+        <w:rPr>
+          <w:rFonts w:ascii="Courier New" w:eastAsia="Times New Roman" w:hAnsi="Courier New" w:cs="Courier New"/>
+          <w:kern w:val="0"/>
+          <w:sz w:val="20"/>
+          <w:szCs w:val="20"/>
+          <w:lang w:eastAsia="es-ES"/>
+          <w14:ligatures w14:val="none"/>
+        </w:rPr>
+        <w:t>login</w:t>
+      </w:r>
+      <w:proofErr w:type="spellEnd"/>
+      <w:r>
+        <w:rPr>
+          <w:rFonts w:ascii="Times New Roman" w:eastAsia="Times New Roman" w:hAnsi="Times New Roman" w:cs="Times New Roman"/>
+          <w:kern w:val="0"/>
+          <w:lang w:eastAsia="es-ES"/>
+          <w14:ligatures w14:val="none"/>
+        </w:rPr>
+        <w:t xml:space="preserve">) y rutas protegidas. Para estas últimas, programamos un componente </w:t>
+      </w:r>
+      <w:proofErr w:type="spellStart"/>
+      <w:r>
+        <w:rPr>
+          <w:rFonts w:ascii="Courier New" w:eastAsia="Times New Roman" w:hAnsi="Courier New" w:cs="Courier New"/>
+          <w:kern w:val="0"/>
+          <w:sz w:val="20"/>
+          <w:szCs w:val="20"/>
+          <w:lang w:eastAsia="es-ES"/>
+          <w14:ligatures w14:val="none"/>
+        </w:rPr>
+        <w:t>ProtectedRoute</w:t>
+      </w:r>
+      <w:proofErr w:type="spellEnd"/>
+      <w:r>
+        <w:rPr>
+          <w:rFonts w:ascii="Times New Roman" w:eastAsia="Times New Roman" w:hAnsi="Times New Roman" w:cs="Times New Roman"/>
+          <w:kern w:val="0"/>
+          <w:lang w:eastAsia="es-ES"/>
+          <w14:ligatures w14:val="none"/>
+        </w:rPr>
+        <w:t xml:space="preserve"> que actúa como "guardaespaldas", expulsando al Login a cualquier usuario que intente entrar al </w:t>
+      </w:r>
+      <w:proofErr w:type="spellStart"/>
+      <w:r>
+        <w:rPr>
+          <w:rFonts w:ascii="Times New Roman" w:eastAsia="Times New Roman" w:hAnsi="Times New Roman" w:cs="Times New Roman"/>
+          <w:kern w:val="0"/>
+          <w:lang w:eastAsia="es-ES"/>
+          <w14:ligatures w14:val="none"/>
+        </w:rPr>
+        <w:t>Dashboard</w:t>
+      </w:r>
+      <w:proofErr w:type="spellEnd"/>
+      <w:r>
+        <w:rPr>
+          <w:rFonts w:ascii="Times New Roman" w:eastAsia="Times New Roman" w:hAnsi="Times New Roman" w:cs="Times New Roman"/>
+          <w:kern w:val="0"/>
+          <w:lang w:eastAsia="es-ES"/>
+          <w14:ligatures w14:val="none"/>
+        </w:rPr>
+        <w:t xml:space="preserve"> sin estar autenticado.</w:t>
+      </w:r>
+    </w:p>
+    <w:p>
+      <w:pPr>
+        <w:spacing w:before="100" w:beforeAutospacing="1" w:after="100" w:afterAutospacing="1" w:line="240" w:lineRule="auto"/>
+        <w:rPr>
+          <w:rFonts w:ascii="Times New Roman" w:eastAsia="Times New Roman" w:hAnsi="Times New Roman" w:cs="Times New Roman"/>
+          <w:kern w:val="0"/>
+          <w:lang w:eastAsia="es-ES"/>
+          <w14:ligatures w14:val="none"/>
+        </w:rPr>
+      </w:pPr>
+      <w:r>
+        <w:rPr>
+          <w:rFonts w:ascii="Times New Roman" w:eastAsia="Times New Roman" w:hAnsi="Times New Roman" w:cs="Times New Roman"/>
+          <w:b/>
+          <w:bCs/>
+          <w:kern w:val="0"/>
+          <w:lang w:eastAsia="es-ES"/>
+          <w14:ligatures w14:val="none"/>
+        </w:rPr>
+        <w:lastRenderedPageBreak/>
+        <w:t>2.4.- Diseño y Maquetación (</w:t>
+      </w:r>
+      <w:proofErr w:type="spellStart"/>
+      <w:r>
+        <w:rPr>
+          <w:rFonts w:ascii="Times New Roman" w:eastAsia="Times New Roman" w:hAnsi="Times New Roman" w:cs="Times New Roman"/>
+          <w:b/>
+          <w:bCs/>
+          <w:kern w:val="0"/>
+          <w:lang w:eastAsia="es-ES"/>
+          <w14:ligatures w14:val="none"/>
+        </w:rPr>
+        <w:t>Tailwind</w:t>
+      </w:r>
+      <w:proofErr w:type="spellEnd"/>
+      <w:r>
+        <w:rPr>
+          <w:rFonts w:ascii="Times New Roman" w:eastAsia="Times New Roman" w:hAnsi="Times New Roman" w:cs="Times New Roman"/>
+          <w:b/>
+          <w:bCs/>
+          <w:kern w:val="0"/>
+          <w:lang w:eastAsia="es-ES"/>
+          <w14:ligatures w14:val="none"/>
+        </w:rPr>
+        <w:t xml:space="preserve"> CSS y resolución de bugs)</w:t>
+      </w:r>
+      <w:r>
+        <w:rPr>
+          <w:rFonts w:ascii="Times New Roman" w:eastAsia="Times New Roman" w:hAnsi="Times New Roman" w:cs="Times New Roman"/>
+          <w:kern w:val="0"/>
+          <w:lang w:eastAsia="es-ES"/>
+          <w14:ligatures w14:val="none"/>
+        </w:rPr>
+        <w:t xml:space="preserve"> Para darle un aspecto profesional y corporativo a la aplicación, integramos </w:t>
+      </w:r>
+      <w:proofErr w:type="spellStart"/>
+      <w:r>
+        <w:rPr>
+          <w:rFonts w:ascii="Times New Roman" w:eastAsia="Times New Roman" w:hAnsi="Times New Roman" w:cs="Times New Roman"/>
+          <w:kern w:val="0"/>
+          <w:lang w:eastAsia="es-ES"/>
+          <w14:ligatures w14:val="none"/>
+        </w:rPr>
+        <w:t>Tailwind</w:t>
+      </w:r>
+      <w:proofErr w:type="spellEnd"/>
+      <w:r>
+        <w:rPr>
+          <w:rFonts w:ascii="Times New Roman" w:eastAsia="Times New Roman" w:hAnsi="Times New Roman" w:cs="Times New Roman"/>
+          <w:kern w:val="0"/>
+          <w:lang w:eastAsia="es-ES"/>
+          <w14:ligatures w14:val="none"/>
+        </w:rPr>
+        <w:t xml:space="preserve"> CSS. Durante la instalación nos encontramos con varios problemas técnicos:</w:t>
+      </w:r>
+    </w:p>
+    <w:p>
+      <w:pPr>
+        <w:numPr>
+          <w:ilvl w:val="0"/>
+          <w:numId w:val="16"/>
+        </w:numPr>
+        <w:spacing w:before="100" w:beforeAutospacing="1" w:after="100" w:afterAutospacing="1" w:line="240" w:lineRule="auto"/>
+        <w:rPr>
+          <w:rFonts w:ascii="Times New Roman" w:eastAsia="Times New Roman" w:hAnsi="Times New Roman" w:cs="Times New Roman"/>
+          <w:kern w:val="0"/>
+          <w:lang w:eastAsia="es-ES"/>
+          <w14:ligatures w14:val="none"/>
+        </w:rPr>
+      </w:pPr>
+      <w:r>
+        <w:rPr>
+          <w:rFonts w:ascii="Times New Roman" w:eastAsia="Times New Roman" w:hAnsi="Times New Roman" w:cs="Times New Roman"/>
+          <w:b/>
+          <w:bCs/>
+          <w:kern w:val="0"/>
+          <w:lang w:eastAsia="es-ES"/>
+          <w14:ligatures w14:val="none"/>
+        </w:rPr>
+        <w:t>Error de ejecutable NPM:</w:t>
+      </w:r>
+      <w:r>
+        <w:rPr>
+          <w:rFonts w:ascii="Times New Roman" w:eastAsia="Times New Roman" w:hAnsi="Times New Roman" w:cs="Times New Roman"/>
+          <w:kern w:val="0"/>
+          <w:lang w:eastAsia="es-ES"/>
+          <w14:ligatures w14:val="none"/>
+        </w:rPr>
+        <w:t xml:space="preserve"> El comando </w:t>
+      </w:r>
+      <w:proofErr w:type="spellStart"/>
+      <w:r>
+        <w:rPr>
+          <w:rFonts w:ascii="Courier New" w:eastAsia="Times New Roman" w:hAnsi="Courier New" w:cs="Courier New"/>
+          <w:kern w:val="0"/>
+          <w:sz w:val="20"/>
+          <w:szCs w:val="20"/>
+          <w:lang w:eastAsia="es-ES"/>
+          <w14:ligatures w14:val="none"/>
+        </w:rPr>
+        <w:t>npx</w:t>
+      </w:r>
+      <w:proofErr w:type="spellEnd"/>
+      <w:r>
+        <w:rPr>
+          <w:rFonts w:ascii="Courier New" w:eastAsia="Times New Roman" w:hAnsi="Courier New" w:cs="Courier New"/>
+          <w:kern w:val="0"/>
+          <w:sz w:val="20"/>
+          <w:szCs w:val="20"/>
+          <w:lang w:eastAsia="es-ES"/>
+          <w14:ligatures w14:val="none"/>
+        </w:rPr>
+        <w:t xml:space="preserve"> </w:t>
+      </w:r>
+      <w:proofErr w:type="spellStart"/>
+      <w:r>
+        <w:rPr>
+          <w:rFonts w:ascii="Courier New" w:eastAsia="Times New Roman" w:hAnsi="Courier New" w:cs="Courier New"/>
+          <w:kern w:val="0"/>
+          <w:sz w:val="20"/>
+          <w:szCs w:val="20"/>
+          <w:lang w:eastAsia="es-ES"/>
+          <w14:ligatures w14:val="none"/>
+        </w:rPr>
+        <w:t>tailwindcss</w:t>
+      </w:r>
+      <w:proofErr w:type="spellEnd"/>
+      <w:r>
+        <w:rPr>
+          <w:rFonts w:ascii="Courier New" w:eastAsia="Times New Roman" w:hAnsi="Courier New" w:cs="Courier New"/>
+          <w:kern w:val="0"/>
+          <w:sz w:val="20"/>
+          <w:szCs w:val="20"/>
+          <w:lang w:eastAsia="es-ES"/>
+          <w14:ligatures w14:val="none"/>
+        </w:rPr>
+        <w:t xml:space="preserve"> </w:t>
+      </w:r>
+      <w:proofErr w:type="spellStart"/>
+      <w:r>
+        <w:rPr>
+          <w:rFonts w:ascii="Courier New" w:eastAsia="Times New Roman" w:hAnsi="Courier New" w:cs="Courier New"/>
+          <w:kern w:val="0"/>
+          <w:sz w:val="20"/>
+          <w:szCs w:val="20"/>
+          <w:lang w:eastAsia="es-ES"/>
+          <w14:ligatures w14:val="none"/>
+        </w:rPr>
+        <w:t>init</w:t>
+      </w:r>
+      <w:proofErr w:type="spellEnd"/>
+      <w:r>
+        <w:rPr>
+          <w:rFonts w:ascii="Times New Roman" w:eastAsia="Times New Roman" w:hAnsi="Times New Roman" w:cs="Times New Roman"/>
+          <w:kern w:val="0"/>
+          <w:lang w:eastAsia="es-ES"/>
+          <w14:ligatures w14:val="none"/>
+        </w:rPr>
+        <w:t xml:space="preserve"> fallaba por la caché de NPM. Lo solucionamos creando a mano los archivos </w:t>
+      </w:r>
+      <w:r>
+        <w:rPr>
+          <w:rFonts w:ascii="Courier New" w:eastAsia="Times New Roman" w:hAnsi="Courier New" w:cs="Courier New"/>
+          <w:kern w:val="0"/>
+          <w:sz w:val="20"/>
+          <w:szCs w:val="20"/>
+          <w:lang w:eastAsia="es-ES"/>
+          <w14:ligatures w14:val="none"/>
+        </w:rPr>
+        <w:t>tailwind.config.js</w:t>
+      </w:r>
+      <w:r>
+        <w:rPr>
+          <w:rFonts w:ascii="Times New Roman" w:eastAsia="Times New Roman" w:hAnsi="Times New Roman" w:cs="Times New Roman"/>
+          <w:kern w:val="0"/>
+          <w:lang w:eastAsia="es-ES"/>
+          <w14:ligatures w14:val="none"/>
+        </w:rPr>
+        <w:t xml:space="preserve"> y </w:t>
+      </w:r>
+      <w:r>
+        <w:rPr>
+          <w:rFonts w:ascii="Courier New" w:eastAsia="Times New Roman" w:hAnsi="Courier New" w:cs="Courier New"/>
+          <w:kern w:val="0"/>
+          <w:sz w:val="20"/>
+          <w:szCs w:val="20"/>
+          <w:lang w:eastAsia="es-ES"/>
+          <w14:ligatures w14:val="none"/>
+        </w:rPr>
+        <w:t>postcss.config.js</w:t>
+      </w:r>
+      <w:r>
+        <w:rPr>
+          <w:rFonts w:ascii="Times New Roman" w:eastAsia="Times New Roman" w:hAnsi="Times New Roman" w:cs="Times New Roman"/>
+          <w:kern w:val="0"/>
+          <w:lang w:eastAsia="es-ES"/>
+          <w14:ligatures w14:val="none"/>
+        </w:rPr>
+        <w:t>.</w:t>
+      </w:r>
+    </w:p>
+    <w:p>
+      <w:pPr>
+        <w:numPr>
+          <w:ilvl w:val="0"/>
+          <w:numId w:val="16"/>
+        </w:numPr>
+        <w:spacing w:before="100" w:beforeAutospacing="1" w:after="100" w:afterAutospacing="1" w:line="240" w:lineRule="auto"/>
+        <w:rPr>
+          <w:rFonts w:ascii="Times New Roman" w:eastAsia="Times New Roman" w:hAnsi="Times New Roman" w:cs="Times New Roman"/>
+          <w:kern w:val="0"/>
+          <w:lang w:eastAsia="es-ES"/>
+          <w14:ligatures w14:val="none"/>
+        </w:rPr>
+      </w:pPr>
+      <w:r>
+        <w:rPr>
+          <w:rFonts w:ascii="Times New Roman" w:eastAsia="Times New Roman" w:hAnsi="Times New Roman" w:cs="Times New Roman"/>
+          <w:b/>
+          <w:bCs/>
+          <w:kern w:val="0"/>
+          <w:lang w:eastAsia="es-ES"/>
+          <w14:ligatures w14:val="none"/>
+        </w:rPr>
+        <w:t xml:space="preserve">Incompatibilidad </w:t>
+      </w:r>
+      <w:proofErr w:type="spellStart"/>
+      <w:r>
+        <w:rPr>
+          <w:rFonts w:ascii="Times New Roman" w:eastAsia="Times New Roman" w:hAnsi="Times New Roman" w:cs="Times New Roman"/>
+          <w:b/>
+          <w:bCs/>
+          <w:kern w:val="0"/>
+          <w:lang w:eastAsia="es-ES"/>
+          <w14:ligatures w14:val="none"/>
+        </w:rPr>
+        <w:t>Tailwind</w:t>
+      </w:r>
+      <w:proofErr w:type="spellEnd"/>
+      <w:r>
+        <w:rPr>
+          <w:rFonts w:ascii="Times New Roman" w:eastAsia="Times New Roman" w:hAnsi="Times New Roman" w:cs="Times New Roman"/>
+          <w:b/>
+          <w:bCs/>
+          <w:kern w:val="0"/>
+          <w:lang w:eastAsia="es-ES"/>
+          <w14:ligatures w14:val="none"/>
+        </w:rPr>
+        <w:t xml:space="preserve"> v4:</w:t>
+      </w:r>
+      <w:r>
+        <w:rPr>
+          <w:rFonts w:ascii="Times New Roman" w:eastAsia="Times New Roman" w:hAnsi="Times New Roman" w:cs="Times New Roman"/>
+          <w:kern w:val="0"/>
+          <w:lang w:eastAsia="es-ES"/>
+          <w14:ligatures w14:val="none"/>
+        </w:rPr>
+        <w:t xml:space="preserve"> Vite lanzaba un error de </w:t>
+      </w:r>
+      <w:proofErr w:type="spellStart"/>
+      <w:r>
+        <w:rPr>
+          <w:rFonts w:ascii="Times New Roman" w:eastAsia="Times New Roman" w:hAnsi="Times New Roman" w:cs="Times New Roman"/>
+          <w:kern w:val="0"/>
+          <w:lang w:eastAsia="es-ES"/>
+          <w14:ligatures w14:val="none"/>
+        </w:rPr>
+        <w:t>PostCSS</w:t>
+      </w:r>
+      <w:proofErr w:type="spellEnd"/>
+      <w:r>
+        <w:rPr>
+          <w:rFonts w:ascii="Times New Roman" w:eastAsia="Times New Roman" w:hAnsi="Times New Roman" w:cs="Times New Roman"/>
+          <w:kern w:val="0"/>
+          <w:lang w:eastAsia="es-ES"/>
+          <w14:ligatures w14:val="none"/>
+        </w:rPr>
+        <w:t xml:space="preserve"> al arrancar. Descubrimos que NPM nos había instalado la recientísima versión 4 de </w:t>
+      </w:r>
+      <w:proofErr w:type="spellStart"/>
+      <w:r>
+        <w:rPr>
+          <w:rFonts w:ascii="Times New Roman" w:eastAsia="Times New Roman" w:hAnsi="Times New Roman" w:cs="Times New Roman"/>
+          <w:kern w:val="0"/>
+          <w:lang w:eastAsia="es-ES"/>
+          <w14:ligatures w14:val="none"/>
+        </w:rPr>
+        <w:t>Tailwind</w:t>
+      </w:r>
+      <w:proofErr w:type="spellEnd"/>
+      <w:r>
+        <w:rPr>
+          <w:rFonts w:ascii="Times New Roman" w:eastAsia="Times New Roman" w:hAnsi="Times New Roman" w:cs="Times New Roman"/>
+          <w:kern w:val="0"/>
+          <w:lang w:eastAsia="es-ES"/>
+          <w14:ligatures w14:val="none"/>
+        </w:rPr>
+        <w:t xml:space="preserve">, la cual usa una arquitectura distinta. Lo arreglamos haciendo un </w:t>
+      </w:r>
+      <w:proofErr w:type="spellStart"/>
+      <w:r>
+        <w:rPr>
+          <w:rFonts w:ascii="Times New Roman" w:eastAsia="Times New Roman" w:hAnsi="Times New Roman" w:cs="Times New Roman"/>
+          <w:i/>
+          <w:iCs/>
+          <w:kern w:val="0"/>
+          <w:lang w:eastAsia="es-ES"/>
+          <w14:ligatures w14:val="none"/>
+        </w:rPr>
+        <w:t>downgrade</w:t>
+      </w:r>
+      <w:proofErr w:type="spellEnd"/>
+      <w:r>
+        <w:rPr>
+          <w:rFonts w:ascii="Times New Roman" w:eastAsia="Times New Roman" w:hAnsi="Times New Roman" w:cs="Times New Roman"/>
+          <w:kern w:val="0"/>
+          <w:lang w:eastAsia="es-ES"/>
+          <w14:ligatures w14:val="none"/>
+        </w:rPr>
+        <w:t xml:space="preserve"> forzado a la versión estable 3 (</w:t>
+      </w:r>
+      <w:proofErr w:type="spellStart"/>
+      <w:r>
+        <w:rPr>
+          <w:rFonts w:ascii="Courier New" w:eastAsia="Times New Roman" w:hAnsi="Courier New" w:cs="Courier New"/>
+          <w:kern w:val="0"/>
+          <w:sz w:val="20"/>
+          <w:szCs w:val="20"/>
+          <w:lang w:eastAsia="es-ES"/>
+          <w14:ligatures w14:val="none"/>
+        </w:rPr>
+        <w:t>npm</w:t>
+      </w:r>
+      <w:proofErr w:type="spellEnd"/>
+      <w:r>
+        <w:rPr>
+          <w:rFonts w:ascii="Courier New" w:eastAsia="Times New Roman" w:hAnsi="Courier New" w:cs="Courier New"/>
+          <w:kern w:val="0"/>
+          <w:sz w:val="20"/>
+          <w:szCs w:val="20"/>
+          <w:lang w:eastAsia="es-ES"/>
+          <w14:ligatures w14:val="none"/>
+        </w:rPr>
+        <w:t xml:space="preserve"> </w:t>
+      </w:r>
+      <w:proofErr w:type="spellStart"/>
+      <w:r>
+        <w:rPr>
+          <w:rFonts w:ascii="Courier New" w:eastAsia="Times New Roman" w:hAnsi="Courier New" w:cs="Courier New"/>
+          <w:kern w:val="0"/>
+          <w:sz w:val="20"/>
+          <w:szCs w:val="20"/>
+          <w:lang w:eastAsia="es-ES"/>
+          <w14:ligatures w14:val="none"/>
+        </w:rPr>
+        <w:t>install</w:t>
+      </w:r>
+      <w:proofErr w:type="spellEnd"/>
+      <w:r>
+        <w:rPr>
+          <w:rFonts w:ascii="Courier New" w:eastAsia="Times New Roman" w:hAnsi="Courier New" w:cs="Courier New"/>
+          <w:kern w:val="0"/>
+          <w:sz w:val="20"/>
+          <w:szCs w:val="20"/>
+          <w:lang w:eastAsia="es-ES"/>
+          <w14:ligatures w14:val="none"/>
+        </w:rPr>
+        <w:t xml:space="preserve"> -D </w:t>
+      </w:r>
+      <w:proofErr w:type="spellStart"/>
+      <w:r>
+        <w:rPr>
+          <w:rFonts w:ascii="Courier New" w:eastAsia="Times New Roman" w:hAnsi="Courier New" w:cs="Courier New"/>
+          <w:kern w:val="0"/>
+          <w:sz w:val="20"/>
+          <w:szCs w:val="20"/>
+          <w:lang w:eastAsia="es-ES"/>
+          <w14:ligatures w14:val="none"/>
+        </w:rPr>
+        <w:t>tailwindcss</w:t>
+      </w:r>
+      <w:proofErr w:type="spellEnd"/>
+      <w:r>
+        <w:rPr>
+          <w:rFonts w:ascii="Courier New" w:eastAsia="Times New Roman" w:hAnsi="Courier New" w:cs="Courier New"/>
+          <w:kern w:val="0"/>
+          <w:sz w:val="20"/>
+          <w:szCs w:val="20"/>
+          <w:lang w:eastAsia="es-ES"/>
+          <w14:ligatures w14:val="none"/>
+        </w:rPr>
+        <w:t>@^3.4</w:t>
+      </w:r>
+      <w:r>
+        <w:rPr>
+          <w:rFonts w:ascii="Times New Roman" w:eastAsia="Times New Roman" w:hAnsi="Times New Roman" w:cs="Times New Roman"/>
+          <w:kern w:val="0"/>
+          <w:lang w:eastAsia="es-ES"/>
+          <w14:ligatures w14:val="none"/>
+        </w:rPr>
+        <w:t>).</w:t>
+      </w:r>
+    </w:p>
+    <w:p>
+      <w:pPr>
+        <w:numPr>
+          <w:ilvl w:val="0"/>
+          <w:numId w:val="16"/>
+        </w:numPr>
+        <w:spacing w:before="100" w:beforeAutospacing="1" w:after="100" w:afterAutospacing="1" w:line="240" w:lineRule="auto"/>
+        <w:rPr>
+          <w:rFonts w:ascii="Times New Roman" w:eastAsia="Times New Roman" w:hAnsi="Times New Roman" w:cs="Times New Roman"/>
+          <w:kern w:val="0"/>
+          <w:lang w:eastAsia="es-ES"/>
+          <w14:ligatures w14:val="none"/>
+        </w:rPr>
+      </w:pPr>
+      <w:r>
+        <w:rPr>
+          <w:rFonts w:ascii="Times New Roman" w:eastAsia="Times New Roman" w:hAnsi="Times New Roman" w:cs="Times New Roman"/>
+          <w:b/>
+          <w:bCs/>
+          <w:kern w:val="0"/>
+          <w:lang w:eastAsia="es-ES"/>
+          <w14:ligatures w14:val="none"/>
+        </w:rPr>
+        <w:t>Diseño Final:</w:t>
+      </w:r>
+      <w:r>
+        <w:rPr>
+          <w:rFonts w:ascii="Times New Roman" w:eastAsia="Times New Roman" w:hAnsi="Times New Roman" w:cs="Times New Roman"/>
+          <w:kern w:val="0"/>
+          <w:lang w:eastAsia="es-ES"/>
+          <w14:ligatures w14:val="none"/>
+        </w:rPr>
+        <w:t xml:space="preserve"> Implementamos una interfaz "Premium". Creamos un Login a pantalla completa con un fondo degradado oscuro elegante y una tarjeta blanca con inputs de alto contraste. Para el </w:t>
+      </w:r>
+      <w:proofErr w:type="spellStart"/>
+      <w:r>
+        <w:rPr>
+          <w:rFonts w:ascii="Times New Roman" w:eastAsia="Times New Roman" w:hAnsi="Times New Roman" w:cs="Times New Roman"/>
+          <w:kern w:val="0"/>
+          <w:lang w:eastAsia="es-ES"/>
+          <w14:ligatures w14:val="none"/>
+        </w:rPr>
+        <w:t>Dashboard</w:t>
+      </w:r>
+      <w:proofErr w:type="spellEnd"/>
+      <w:r>
+        <w:rPr>
+          <w:rFonts w:ascii="Times New Roman" w:eastAsia="Times New Roman" w:hAnsi="Times New Roman" w:cs="Times New Roman"/>
+          <w:kern w:val="0"/>
+          <w:lang w:eastAsia="es-ES"/>
+          <w14:ligatures w14:val="none"/>
+        </w:rPr>
+        <w:t>, sustituimos el diseño básico por un panel de control avanzado con un menú lateral oscuro (</w:t>
+      </w:r>
+      <w:proofErr w:type="spellStart"/>
+      <w:r>
+        <w:rPr>
+          <w:rFonts w:ascii="Times New Roman" w:eastAsia="Times New Roman" w:hAnsi="Times New Roman" w:cs="Times New Roman"/>
+          <w:kern w:val="0"/>
+          <w:lang w:eastAsia="es-ES"/>
+          <w14:ligatures w14:val="none"/>
+        </w:rPr>
+        <w:t>Sidebar</w:t>
+      </w:r>
+      <w:proofErr w:type="spellEnd"/>
+      <w:r>
+        <w:rPr>
+          <w:rFonts w:ascii="Times New Roman" w:eastAsia="Times New Roman" w:hAnsi="Times New Roman" w:cs="Times New Roman"/>
+          <w:kern w:val="0"/>
+          <w:lang w:eastAsia="es-ES"/>
+          <w14:ligatures w14:val="none"/>
+        </w:rPr>
+        <w:t>), tarjetas redondeadas para los datos del usuario y alertas condicionales exclusivas para los administradores.</w:t>
       </w:r>
     </w:p>
     <w:p>
@@ -6965,6 +8739,304 @@
     </w:lvl>
   </w:abstractNum>
   <w:abstractNum w:abstractNumId="1" w15:restartNumberingAfterBreak="0">
+    <w:nsid w:val="02F5103A"/>
+    <w:multiLevelType w:val="multilevel"/>
+    <w:tmpl w:val="56EC198A"/>
+    <w:lvl w:ilvl="0">
+      <w:start w:val="1"/>
+      <w:numFmt w:val="bullet"/>
+      <w:lvlText w:val=""/>
+      <w:lvlJc w:val="left"/>
+      <w:pPr>
+        <w:tabs>
+          <w:tab w:val="num" w:pos="720"/>
+        </w:tabs>
+        <w:ind w:left="720" w:hanging="360"/>
+      </w:pPr>
+      <w:rPr>
+        <w:rFonts w:ascii="Symbol" w:hAnsi="Symbol" w:hint="default"/>
+        <w:sz w:val="20"/>
+      </w:rPr>
+    </w:lvl>
+    <w:lvl w:ilvl="1" w:tentative="1">
+      <w:start w:val="1"/>
+      <w:numFmt w:val="bullet"/>
+      <w:lvlText w:val="o"/>
+      <w:lvlJc w:val="left"/>
+      <w:pPr>
+        <w:tabs>
+          <w:tab w:val="num" w:pos="1440"/>
+        </w:tabs>
+        <w:ind w:left="1440" w:hanging="360"/>
+      </w:pPr>
+      <w:rPr>
+        <w:rFonts w:ascii="Courier New" w:hAnsi="Courier New" w:hint="default"/>
+        <w:sz w:val="20"/>
+      </w:rPr>
+    </w:lvl>
+    <w:lvl w:ilvl="2" w:tentative="1">
+      <w:start w:val="1"/>
+      <w:numFmt w:val="bullet"/>
+      <w:lvlText w:val=""/>
+      <w:lvlJc w:val="left"/>
+      <w:pPr>
+        <w:tabs>
+          <w:tab w:val="num" w:pos="2160"/>
+        </w:tabs>
+        <w:ind w:left="2160" w:hanging="360"/>
+      </w:pPr>
+      <w:rPr>
+        <w:rFonts w:ascii="Wingdings" w:hAnsi="Wingdings" w:hint="default"/>
+        <w:sz w:val="20"/>
+      </w:rPr>
+    </w:lvl>
+    <w:lvl w:ilvl="3" w:tentative="1">
+      <w:start w:val="1"/>
+      <w:numFmt w:val="bullet"/>
+      <w:lvlText w:val=""/>
+      <w:lvlJc w:val="left"/>
+      <w:pPr>
+        <w:tabs>
+          <w:tab w:val="num" w:pos="2880"/>
+        </w:tabs>
+        <w:ind w:left="2880" w:hanging="360"/>
+      </w:pPr>
+      <w:rPr>
+        <w:rFonts w:ascii="Wingdings" w:hAnsi="Wingdings" w:hint="default"/>
+        <w:sz w:val="20"/>
+      </w:rPr>
+    </w:lvl>
+    <w:lvl w:ilvl="4" w:tentative="1">
+      <w:start w:val="1"/>
+      <w:numFmt w:val="bullet"/>
+      <w:lvlText w:val=""/>
+      <w:lvlJc w:val="left"/>
+      <w:pPr>
+        <w:tabs>
+          <w:tab w:val="num" w:pos="3600"/>
+        </w:tabs>
+        <w:ind w:left="3600" w:hanging="360"/>
+      </w:pPr>
+      <w:rPr>
+        <w:rFonts w:ascii="Wingdings" w:hAnsi="Wingdings" w:hint="default"/>
+        <w:sz w:val="20"/>
+      </w:rPr>
+    </w:lvl>
+    <w:lvl w:ilvl="5" w:tentative="1">
+      <w:start w:val="1"/>
+      <w:numFmt w:val="bullet"/>
+      <w:lvlText w:val=""/>
+      <w:lvlJc w:val="left"/>
+      <w:pPr>
+        <w:tabs>
+          <w:tab w:val="num" w:pos="4320"/>
+        </w:tabs>
+        <w:ind w:left="4320" w:hanging="360"/>
+      </w:pPr>
+      <w:rPr>
+        <w:rFonts w:ascii="Wingdings" w:hAnsi="Wingdings" w:hint="default"/>
+        <w:sz w:val="20"/>
+      </w:rPr>
+    </w:lvl>
+    <w:lvl w:ilvl="6" w:tentative="1">
+      <w:start w:val="1"/>
+      <w:numFmt w:val="bullet"/>
+      <w:lvlText w:val=""/>
+      <w:lvlJc w:val="left"/>
+      <w:pPr>
+        <w:tabs>
+          <w:tab w:val="num" w:pos="5040"/>
+        </w:tabs>
+        <w:ind w:left="5040" w:hanging="360"/>
+      </w:pPr>
+      <w:rPr>
+        <w:rFonts w:ascii="Wingdings" w:hAnsi="Wingdings" w:hint="default"/>
+        <w:sz w:val="20"/>
+      </w:rPr>
+    </w:lvl>
+    <w:lvl w:ilvl="7" w:tentative="1">
+      <w:start w:val="1"/>
+      <w:numFmt w:val="bullet"/>
+      <w:lvlText w:val=""/>
+      <w:lvlJc w:val="left"/>
+      <w:pPr>
+        <w:tabs>
+          <w:tab w:val="num" w:pos="5760"/>
+        </w:tabs>
+        <w:ind w:left="5760" w:hanging="360"/>
+      </w:pPr>
+      <w:rPr>
+        <w:rFonts w:ascii="Wingdings" w:hAnsi="Wingdings" w:hint="default"/>
+        <w:sz w:val="20"/>
+      </w:rPr>
+    </w:lvl>
+    <w:lvl w:ilvl="8" w:tentative="1">
+      <w:start w:val="1"/>
+      <w:numFmt w:val="bullet"/>
+      <w:lvlText w:val=""/>
+      <w:lvlJc w:val="left"/>
+      <w:pPr>
+        <w:tabs>
+          <w:tab w:val="num" w:pos="6480"/>
+        </w:tabs>
+        <w:ind w:left="6480" w:hanging="360"/>
+      </w:pPr>
+      <w:rPr>
+        <w:rFonts w:ascii="Wingdings" w:hAnsi="Wingdings" w:hint="default"/>
+        <w:sz w:val="20"/>
+      </w:rPr>
+    </w:lvl>
+  </w:abstractNum>
+  <w:abstractNum w:abstractNumId="2" w15:restartNumberingAfterBreak="0">
+    <w:nsid w:val="0F9B50A5"/>
+    <w:multiLevelType w:val="multilevel"/>
+    <w:tmpl w:val="FCB095F6"/>
+    <w:lvl w:ilvl="0">
+      <w:start w:val="1"/>
+      <w:numFmt w:val="bullet"/>
+      <w:lvlText w:val=""/>
+      <w:lvlJc w:val="left"/>
+      <w:pPr>
+        <w:tabs>
+          <w:tab w:val="num" w:pos="720"/>
+        </w:tabs>
+        <w:ind w:left="720" w:hanging="360"/>
+      </w:pPr>
+      <w:rPr>
+        <w:rFonts w:ascii="Symbol" w:hAnsi="Symbol" w:hint="default"/>
+        <w:sz w:val="20"/>
+      </w:rPr>
+    </w:lvl>
+    <w:lvl w:ilvl="1" w:tentative="1">
+      <w:start w:val="1"/>
+      <w:numFmt w:val="bullet"/>
+      <w:lvlText w:val="o"/>
+      <w:lvlJc w:val="left"/>
+      <w:pPr>
+        <w:tabs>
+          <w:tab w:val="num" w:pos="1440"/>
+        </w:tabs>
+        <w:ind w:left="1440" w:hanging="360"/>
+      </w:pPr>
+      <w:rPr>
+        <w:rFonts w:ascii="Courier New" w:hAnsi="Courier New" w:hint="default"/>
+        <w:sz w:val="20"/>
+      </w:rPr>
+    </w:lvl>
+    <w:lvl w:ilvl="2" w:tentative="1">
+      <w:start w:val="1"/>
+      <w:numFmt w:val="bullet"/>
+      <w:lvlText w:val=""/>
+      <w:lvlJc w:val="left"/>
+      <w:pPr>
+        <w:tabs>
+          <w:tab w:val="num" w:pos="2160"/>
+        </w:tabs>
+        <w:ind w:left="2160" w:hanging="360"/>
+      </w:pPr>
+      <w:rPr>
+        <w:rFonts w:ascii="Wingdings" w:hAnsi="Wingdings" w:hint="default"/>
+        <w:sz w:val="20"/>
+      </w:rPr>
+    </w:lvl>
+    <w:lvl w:ilvl="3" w:tentative="1">
+      <w:start w:val="1"/>
+      <w:numFmt w:val="bullet"/>
+      <w:lvlText w:val=""/>
+      <w:lvlJc w:val="left"/>
+      <w:pPr>
+        <w:tabs>
+          <w:tab w:val="num" w:pos="2880"/>
+        </w:tabs>
+        <w:ind w:left="2880" w:hanging="360"/>
+      </w:pPr>
+      <w:rPr>
+        <w:rFonts w:ascii="Wingdings" w:hAnsi="Wingdings" w:hint="default"/>
+        <w:sz w:val="20"/>
+      </w:rPr>
+    </w:lvl>
+    <w:lvl w:ilvl="4" w:tentative="1">
+      <w:start w:val="1"/>
+      <w:numFmt w:val="bullet"/>
+      <w:lvlText w:val=""/>
+      <w:lvlJc w:val="left"/>
+      <w:pPr>
+        <w:tabs>
+          <w:tab w:val="num" w:pos="3600"/>
+        </w:tabs>
+        <w:ind w:left="3600" w:hanging="360"/>
+      </w:pPr>
+      <w:rPr>
+        <w:rFonts w:ascii="Wingdings" w:hAnsi="Wingdings" w:hint="default"/>
+        <w:sz w:val="20"/>
+      </w:rPr>
+    </w:lvl>
+    <w:lvl w:ilvl="5" w:tentative="1">
+      <w:start w:val="1"/>
+      <w:numFmt w:val="bullet"/>
+      <w:lvlText w:val=""/>
+      <w:lvlJc w:val="left"/>
+      <w:pPr>
+        <w:tabs>
+          <w:tab w:val="num" w:pos="4320"/>
+        </w:tabs>
+        <w:ind w:left="4320" w:hanging="360"/>
+      </w:pPr>
+      <w:rPr>
+        <w:rFonts w:ascii="Wingdings" w:hAnsi="Wingdings" w:hint="default"/>
+        <w:sz w:val="20"/>
+      </w:rPr>
+    </w:lvl>
+    <w:lvl w:ilvl="6" w:tentative="1">
+      <w:start w:val="1"/>
+      <w:numFmt w:val="bullet"/>
+      <w:lvlText w:val=""/>
+      <w:lvlJc w:val="left"/>
+      <w:pPr>
+        <w:tabs>
+          <w:tab w:val="num" w:pos="5040"/>
+        </w:tabs>
+        <w:ind w:left="5040" w:hanging="360"/>
+      </w:pPr>
+      <w:rPr>
+        <w:rFonts w:ascii="Wingdings" w:hAnsi="Wingdings" w:hint="default"/>
+        <w:sz w:val="20"/>
+      </w:rPr>
+    </w:lvl>
+    <w:lvl w:ilvl="7" w:tentative="1">
+      <w:start w:val="1"/>
+      <w:numFmt w:val="bullet"/>
+      <w:lvlText w:val=""/>
+      <w:lvlJc w:val="left"/>
+      <w:pPr>
+        <w:tabs>
+          <w:tab w:val="num" w:pos="5760"/>
+        </w:tabs>
+        <w:ind w:left="5760" w:hanging="360"/>
+      </w:pPr>
+      <w:rPr>
+        <w:rFonts w:ascii="Wingdings" w:hAnsi="Wingdings" w:hint="default"/>
+        <w:sz w:val="20"/>
+      </w:rPr>
+    </w:lvl>
+    <w:lvl w:ilvl="8" w:tentative="1">
+      <w:start w:val="1"/>
+      <w:numFmt w:val="bullet"/>
+      <w:lvlText w:val=""/>
+      <w:lvlJc w:val="left"/>
+      <w:pPr>
+        <w:tabs>
+          <w:tab w:val="num" w:pos="6480"/>
+        </w:tabs>
+        <w:ind w:left="6480" w:hanging="360"/>
+      </w:pPr>
+      <w:rPr>
+        <w:rFonts w:ascii="Wingdings" w:hAnsi="Wingdings" w:hint="default"/>
+        <w:sz w:val="20"/>
+      </w:rPr>
+    </w:lvl>
+  </w:abstractNum>
+  <w:abstractNum w:abstractNumId="3" w15:restartNumberingAfterBreak="0">
     <w:nsid w:val="12200342"/>
     <w:multiLevelType w:val="multilevel"/>
     <w:tmpl w:val="7632DFC4"/>
@@ -7113,7 +9185,7 @@
       </w:rPr>
     </w:lvl>
   </w:abstractNum>
-  <w:abstractNum w:abstractNumId="2" w15:restartNumberingAfterBreak="0">
+  <w:abstractNum w:abstractNumId="4" w15:restartNumberingAfterBreak="0">
     <w:nsid w:val="2379124A"/>
     <w:multiLevelType w:val="multilevel"/>
     <w:tmpl w:val="CE9A92CE"/>
@@ -7226,7 +9298,7 @@
       </w:pPr>
     </w:lvl>
   </w:abstractNum>
-  <w:abstractNum w:abstractNumId="3" w15:restartNumberingAfterBreak="0">
+  <w:abstractNum w:abstractNumId="5" w15:restartNumberingAfterBreak="0">
     <w:nsid w:val="25DE004C"/>
     <w:multiLevelType w:val="multilevel"/>
     <w:tmpl w:val="0752286C"/>
@@ -7375,7 +9447,7 @@
       </w:rPr>
     </w:lvl>
   </w:abstractNum>
-  <w:abstractNum w:abstractNumId="4" w15:restartNumberingAfterBreak="0">
+  <w:abstractNum w:abstractNumId="6" w15:restartNumberingAfterBreak="0">
     <w:nsid w:val="2AA11438"/>
     <w:multiLevelType w:val="multilevel"/>
     <w:tmpl w:val="B95A58B0"/>
@@ -7524,7 +9596,7 @@
       </w:rPr>
     </w:lvl>
   </w:abstractNum>
-  <w:abstractNum w:abstractNumId="5" w15:restartNumberingAfterBreak="0">
+  <w:abstractNum w:abstractNumId="7" w15:restartNumberingAfterBreak="0">
     <w:nsid w:val="32C56D4A"/>
     <w:multiLevelType w:val="multilevel"/>
     <w:tmpl w:val="E9FADAF4"/>
@@ -7673,7 +9745,7 @@
       </w:rPr>
     </w:lvl>
   </w:abstractNum>
-  <w:abstractNum w:abstractNumId="6" w15:restartNumberingAfterBreak="0">
+  <w:abstractNum w:abstractNumId="8" w15:restartNumberingAfterBreak="0">
     <w:nsid w:val="40DA2409"/>
     <w:multiLevelType w:val="multilevel"/>
     <w:tmpl w:val="3A98473A"/>
@@ -7822,7 +9894,7 @@
       </w:rPr>
     </w:lvl>
   </w:abstractNum>
-  <w:abstractNum w:abstractNumId="7" w15:restartNumberingAfterBreak="0">
+  <w:abstractNum w:abstractNumId="9" w15:restartNumberingAfterBreak="0">
     <w:nsid w:val="4110570B"/>
     <w:multiLevelType w:val="multilevel"/>
     <w:tmpl w:val="F620DA4E"/>
@@ -7935,7 +10007,7 @@
       </w:rPr>
     </w:lvl>
   </w:abstractNum>
-  <w:abstractNum w:abstractNumId="8" w15:restartNumberingAfterBreak="0">
+  <w:abstractNum w:abstractNumId="10" w15:restartNumberingAfterBreak="0">
     <w:nsid w:val="4E101328"/>
     <w:multiLevelType w:val="multilevel"/>
     <w:tmpl w:val="49A244B0"/>
@@ -8084,7 +10156,7 @@
       </w:rPr>
     </w:lvl>
   </w:abstractNum>
-  <w:abstractNum w:abstractNumId="9" w15:restartNumberingAfterBreak="0">
+  <w:abstractNum w:abstractNumId="11" w15:restartNumberingAfterBreak="0">
     <w:nsid w:val="59125338"/>
     <w:multiLevelType w:val="multilevel"/>
     <w:tmpl w:val="C24687FE"/>
@@ -8233,7 +10305,7 @@
       </w:rPr>
     </w:lvl>
   </w:abstractNum>
-  <w:abstractNum w:abstractNumId="10" w15:restartNumberingAfterBreak="0">
+  <w:abstractNum w:abstractNumId="12" w15:restartNumberingAfterBreak="0">
     <w:nsid w:val="5B0E6A37"/>
     <w:multiLevelType w:val="multilevel"/>
     <w:tmpl w:val="19CE6DFA"/>
@@ -8382,7 +10454,156 @@
       </w:rPr>
     </w:lvl>
   </w:abstractNum>
-  <w:abstractNum w:abstractNumId="11" w15:restartNumberingAfterBreak="0">
+  <w:abstractNum w:abstractNumId="13" w15:restartNumberingAfterBreak="0">
+    <w:nsid w:val="6AAB5D27"/>
+    <w:multiLevelType w:val="multilevel"/>
+    <w:tmpl w:val="D9A8A788"/>
+    <w:lvl w:ilvl="0">
+      <w:start w:val="1"/>
+      <w:numFmt w:val="bullet"/>
+      <w:lvlText w:val=""/>
+      <w:lvlJc w:val="left"/>
+      <w:pPr>
+        <w:tabs>
+          <w:tab w:val="num" w:pos="720"/>
+        </w:tabs>
+        <w:ind w:left="720" w:hanging="360"/>
+      </w:pPr>
+      <w:rPr>
+        <w:rFonts w:ascii="Symbol" w:hAnsi="Symbol" w:hint="default"/>
+        <w:sz w:val="20"/>
+      </w:rPr>
+    </w:lvl>
+    <w:lvl w:ilvl="1" w:tentative="1">
+      <w:start w:val="1"/>
+      <w:numFmt w:val="bullet"/>
+      <w:lvlText w:val="o"/>
+      <w:lvlJc w:val="left"/>
+      <w:pPr>
+        <w:tabs>
+          <w:tab w:val="num" w:pos="1440"/>
+        </w:tabs>
+        <w:ind w:left="1440" w:hanging="360"/>
+      </w:pPr>
+      <w:rPr>
+        <w:rFonts w:ascii="Courier New" w:hAnsi="Courier New" w:hint="default"/>
+        <w:sz w:val="20"/>
+      </w:rPr>
+    </w:lvl>
+    <w:lvl w:ilvl="2" w:tentative="1">
+      <w:start w:val="1"/>
+      <w:numFmt w:val="bullet"/>
+      <w:lvlText w:val=""/>
+      <w:lvlJc w:val="left"/>
+      <w:pPr>
+        <w:tabs>
+          <w:tab w:val="num" w:pos="2160"/>
+        </w:tabs>
+        <w:ind w:left="2160" w:hanging="360"/>
+      </w:pPr>
+      <w:rPr>
+        <w:rFonts w:ascii="Wingdings" w:hAnsi="Wingdings" w:hint="default"/>
+        <w:sz w:val="20"/>
+      </w:rPr>
+    </w:lvl>
+    <w:lvl w:ilvl="3" w:tentative="1">
+      <w:start w:val="1"/>
+      <w:numFmt w:val="bullet"/>
+      <w:lvlText w:val=""/>
+      <w:lvlJc w:val="left"/>
+      <w:pPr>
+        <w:tabs>
+          <w:tab w:val="num" w:pos="2880"/>
+        </w:tabs>
+        <w:ind w:left="2880" w:hanging="360"/>
+      </w:pPr>
+      <w:rPr>
+        <w:rFonts w:ascii="Wingdings" w:hAnsi="Wingdings" w:hint="default"/>
+        <w:sz w:val="20"/>
+      </w:rPr>
+    </w:lvl>
+    <w:lvl w:ilvl="4" w:tentative="1">
+      <w:start w:val="1"/>
+      <w:numFmt w:val="bullet"/>
+      <w:lvlText w:val=""/>
+      <w:lvlJc w:val="left"/>
+      <w:pPr>
+        <w:tabs>
+          <w:tab w:val="num" w:pos="3600"/>
+        </w:tabs>
+        <w:ind w:left="3600" w:hanging="360"/>
+      </w:pPr>
+      <w:rPr>
+        <w:rFonts w:ascii="Wingdings" w:hAnsi="Wingdings" w:hint="default"/>
+        <w:sz w:val="20"/>
+      </w:rPr>
+    </w:lvl>
+    <w:lvl w:ilvl="5" w:tentative="1">
+      <w:start w:val="1"/>
+      <w:numFmt w:val="bullet"/>
+      <w:lvlText w:val=""/>
+      <w:lvlJc w:val="left"/>
+      <w:pPr>
+        <w:tabs>
+          <w:tab w:val="num" w:pos="4320"/>
+        </w:tabs>
+        <w:ind w:left="4320" w:hanging="360"/>
+      </w:pPr>
+      <w:rPr>
+        <w:rFonts w:ascii="Wingdings" w:hAnsi="Wingdings" w:hint="default"/>
+        <w:sz w:val="20"/>
+      </w:rPr>
+    </w:lvl>
+    <w:lvl w:ilvl="6" w:tentative="1">
+      <w:start w:val="1"/>
+      <w:numFmt w:val="bullet"/>
+      <w:lvlText w:val=""/>
+      <w:lvlJc w:val="left"/>
+      <w:pPr>
+        <w:tabs>
+          <w:tab w:val="num" w:pos="5040"/>
+        </w:tabs>
+        <w:ind w:left="5040" w:hanging="360"/>
+      </w:pPr>
+      <w:rPr>
+        <w:rFonts w:ascii="Wingdings" w:hAnsi="Wingdings" w:hint="default"/>
+        <w:sz w:val="20"/>
+      </w:rPr>
+    </w:lvl>
+    <w:lvl w:ilvl="7" w:tentative="1">
+      <w:start w:val="1"/>
+      <w:numFmt w:val="bullet"/>
+      <w:lvlText w:val=""/>
+      <w:lvlJc w:val="left"/>
+      <w:pPr>
+        <w:tabs>
+          <w:tab w:val="num" w:pos="5760"/>
+        </w:tabs>
+        <w:ind w:left="5760" w:hanging="360"/>
+      </w:pPr>
+      <w:rPr>
+        <w:rFonts w:ascii="Wingdings" w:hAnsi="Wingdings" w:hint="default"/>
+        <w:sz w:val="20"/>
+      </w:rPr>
+    </w:lvl>
+    <w:lvl w:ilvl="8" w:tentative="1">
+      <w:start w:val="1"/>
+      <w:numFmt w:val="bullet"/>
+      <w:lvlText w:val=""/>
+      <w:lvlJc w:val="left"/>
+      <w:pPr>
+        <w:tabs>
+          <w:tab w:val="num" w:pos="6480"/>
+        </w:tabs>
+        <w:ind w:left="6480" w:hanging="360"/>
+      </w:pPr>
+      <w:rPr>
+        <w:rFonts w:ascii="Wingdings" w:hAnsi="Wingdings" w:hint="default"/>
+        <w:sz w:val="20"/>
+      </w:rPr>
+    </w:lvl>
+  </w:abstractNum>
+  <w:abstractNum w:abstractNumId="14" w15:restartNumberingAfterBreak="0">
     <w:nsid w:val="6F1841EA"/>
     <w:multiLevelType w:val="multilevel"/>
     <w:tmpl w:val="DAD80E12"/>
@@ -8495,7 +10716,7 @@
       </w:pPr>
     </w:lvl>
   </w:abstractNum>
-  <w:abstractNum w:abstractNumId="12" w15:restartNumberingAfterBreak="0">
+  <w:abstractNum w:abstractNumId="15" w15:restartNumberingAfterBreak="0">
     <w:nsid w:val="7B1360C6"/>
     <w:multiLevelType w:val="multilevel"/>
     <w:tmpl w:val="9F92510E"/>
@@ -8645,43 +10866,52 @@
     </w:lvl>
   </w:abstractNum>
   <w:num w:numId="1" w16cid:durableId="1220170623">
+    <w:abstractNumId w:val="9"/>
+  </w:num>
+  <w:num w:numId="2" w16cid:durableId="1101410770">
+    <w:abstractNumId w:val="12"/>
+  </w:num>
+  <w:num w:numId="3" w16cid:durableId="1872111180">
+    <w:abstractNumId w:val="3"/>
+  </w:num>
+  <w:num w:numId="4" w16cid:durableId="1164475631">
+    <w:abstractNumId w:val="4"/>
+  </w:num>
+  <w:num w:numId="5" w16cid:durableId="640699226">
     <w:abstractNumId w:val="7"/>
   </w:num>
-  <w:num w:numId="2" w16cid:durableId="1101410770">
-    <w:abstractNumId w:val="10"/>
-  </w:num>
-  <w:num w:numId="3" w16cid:durableId="1872111180">
-    <w:abstractNumId w:val="1"/>
-  </w:num>
-  <w:num w:numId="4" w16cid:durableId="1164475631">
-    <w:abstractNumId w:val="2"/>
-  </w:num>
-  <w:num w:numId="5" w16cid:durableId="640699226">
-    <w:abstractNumId w:val="5"/>
-  </w:num>
   <w:num w:numId="6" w16cid:durableId="287205536">
-    <w:abstractNumId w:val="11"/>
+    <w:abstractNumId w:val="14"/>
   </w:num>
   <w:num w:numId="7" w16cid:durableId="1356423755">
     <w:abstractNumId w:val="0"/>
   </w:num>
   <w:num w:numId="8" w16cid:durableId="2064325305">
+    <w:abstractNumId w:val="8"/>
+  </w:num>
+  <w:num w:numId="9" w16cid:durableId="1525822596">
+    <w:abstractNumId w:val="11"/>
+  </w:num>
+  <w:num w:numId="10" w16cid:durableId="2023119479">
+    <w:abstractNumId w:val="15"/>
+  </w:num>
+  <w:num w:numId="11" w16cid:durableId="961570048">
+    <w:abstractNumId w:val="10"/>
+  </w:num>
+  <w:num w:numId="12" w16cid:durableId="197085956">
+    <w:abstractNumId w:val="5"/>
+  </w:num>
+  <w:num w:numId="13" w16cid:durableId="1630092636">
     <w:abstractNumId w:val="6"/>
   </w:num>
-  <w:num w:numId="9" w16cid:durableId="1525822596">
-    <w:abstractNumId w:val="9"/>
+  <w:num w:numId="14" w16cid:durableId="1273854052">
+    <w:abstractNumId w:val="2"/>
   </w:num>
-  <w:num w:numId="10" w16cid:durableId="2023119479">
-    <w:abstractNumId w:val="12"/>
+  <w:num w:numId="15" w16cid:durableId="1327632357">
+    <w:abstractNumId w:val="13"/>
   </w:num>
-  <w:num w:numId="11" w16cid:durableId="961570048">
-    <w:abstractNumId w:val="8"/>
-  </w:num>
-  <w:num w:numId="12" w16cid:durableId="197085956">
-    <w:abstractNumId w:val="3"/>
-  </w:num>
-  <w:num w:numId="13" w16cid:durableId="1630092636">
-    <w:abstractNumId w:val="4"/>
+  <w:num w:numId="16" w16cid:durableId="333269953">
+    <w:abstractNumId w:val="1"/>
   </w:num>
 </w:numbering>
 </file>

</xml_diff>

<commit_message>
Le faltan los últimos retoques
</commit_message>
<xml_diff>
--- a/Información de la creación del proyecto.docx
+++ b/Información de la creación del proyecto.docx
@@ -8575,6 +8575,42 @@
         <w:pStyle w:val="Ttulo1"/>
       </w:pPr>
     </w:p>
+    <w:p/>
+    <w:p/>
+    <w:p/>
+    <w:p/>
+    <w:p/>
+    <w:p/>
+    <w:p/>
+    <w:p/>
+    <w:p/>
+    <w:p/>
+    <w:p/>
+    <w:p/>
+    <w:p/>
+    <w:p>
+      <w:pPr>
+        <w:tabs>
+          <w:tab w:val="left" w:pos="6480"/>
+        </w:tabs>
+        <w:rPr>
+          <w:rFonts w:asciiTheme="majorHAnsi" w:eastAsiaTheme="majorEastAsia" w:hAnsiTheme="majorHAnsi" w:cstheme="majorBidi"/>
+          <w:color w:val="0F4761" w:themeColor="accent1" w:themeShade="BF"/>
+          <w:sz w:val="40"/>
+          <w:szCs w:val="40"/>
+        </w:rPr>
+      </w:pPr>
+      <w:r>
+        <w:rPr>
+          <w:rFonts w:asciiTheme="majorHAnsi" w:eastAsiaTheme="majorEastAsia" w:hAnsiTheme="majorHAnsi" w:cstheme="majorBidi"/>
+          <w:color w:val="0F4761" w:themeColor="accent1" w:themeShade="BF"/>
+          <w:sz w:val="40"/>
+          <w:szCs w:val="40"/>
+        </w:rPr>
+        <w:tab/>
+      </w:r>
+    </w:p>
+    <w:p/>
     <w:sectPr>
       <w:pgSz w:w="11906" w:h="16838"/>
       <w:pgMar w:top="1417" w:right="1701" w:bottom="1417" w:left="1701" w:header="708" w:footer="708" w:gutter="0"/>

</xml_diff>